<commit_message>
Option B: each cousin given a named title (Madison the Dancer, Carson the Trustworthy, Reid the Noticer, Chayten the Connector, Kellen the Whole, Keira Both-at-Once, Ella the Deciding Face, Aiden the Exactly-Right). Titles given by their magical creature in the cared-for moment, echoed at the showdown beats and Crown ending. Manuscript rebuilt.
</commit_message>
<xml_diff>
--- a/manuscript.docx
+++ b/manuscript.docx
@@ -211,7 +211,7 @@
         <w:t xml:space="preserve"> </w:t>
       </w:r>
       <w:r>
-        <w:t xml:space="preserve">P-001 through P-012</w:t>
+        <w:t xml:space="preserve">P-001 through P-005, then P-010 through P-012.</w:t>
       </w:r>
       <w:r>
         <w:t xml:space="preserve"> </w:t>
@@ -2649,7 +2649,44 @@
         <w:pStyle w:val="BodyText"/>
       </w:pPr>
       <w:r>
-        <w:t xml:space="preserve">"Or each of you goes al</w:t>
+        <w:t xml:space="preserve">“</w:t>
+      </w:r>
+      <w:r>
+        <w:t xml:space="preserve">Or each of you goes alone. All eight regions covered, deepest possible. Hardest.</w:t>
+      </w:r>
+      <w:r>
+        <w:t xml:space="preserve"> </w:t>
+      </w:r>
+      <w:r>
+        <w:rPr>
+          <w:i/>
+        </w:rPr>
+        <w:t xml:space="preserve">Bravest.</w:t>
+      </w:r>
+      <w:r>
+        <w:t xml:space="preserve"> </w:t>
+      </w:r>
+      <w:r>
+        <w:t xml:space="preserve">I won’t tell you which to pick. That part’s yours.</w:t>
+      </w:r>
+      <w:r>
+        <w:t xml:space="preserve">”</w:t>
+      </w:r>
+    </w:p>
+    <w:p>
+      <w:pPr>
+        <w:pStyle w:val="BodyText"/>
+      </w:pPr>
+      <w:r>
+        <w:t xml:space="preserve">He puts the cards back in his pocket.</w:t>
+      </w:r>
+    </w:p>
+    <w:p>
+      <w:pPr>
+        <w:pStyle w:val="BodyText"/>
+      </w:pPr>
+      <w:r>
+        <w:t xml:space="preserve">He says, "You want to play gin rummy after, that</w:t>
       </w:r>
       <w:r>
         <w:t xml:space="preserve"> </w:t>
@@ -3441,6 +3478,26 @@
         <w:pStyle w:val="BodyText"/>
       </w:pPr>
       <w:r>
+        <w:t xml:space="preserve">Pip puts a small wet hand on Madison’s knee.</w:t>
+      </w:r>
+      <w:r>
+        <w:t xml:space="preserve"> </w:t>
+      </w:r>
+      <w:r>
+        <w:t xml:space="preserve">“</w:t>
+      </w:r>
+      <w:r>
+        <w:t xml:space="preserve">And one more thing, before you go. You are Madison the Dancer, who shares her grace with audiences who deserve to see it. The pool will remember that name. You should too.</w:t>
+      </w:r>
+      <w:r>
+        <w:t xml:space="preserve">”</w:t>
+      </w:r>
+    </w:p>
+    <w:p>
+      <w:pPr>
+        <w:pStyle w:val="BodyText"/>
+      </w:pPr>
+      <w:r>
         <w:t xml:space="preserve">Pip nods.</w:t>
       </w:r>
       <w:r>
@@ -5324,7 +5381,7 @@
         <w:pStyle w:val="BodyText"/>
       </w:pPr>
       <w:r>
-        <w:t xml:space="preserve">She hasn’t danced in a year. Maybe more. But her body remembers, the way an old book remembers how to fall open at the right page.</w:t>
+        <w:t xml:space="preserve">She knows the count before her head does. She has danced this same sequence a hundred times this spring; her body falls into it the way an old book falls open at the right page.</w:t>
       </w:r>
     </w:p>
     <w:p>
@@ -5790,232 +5847,17 @@
     </w:p>
     <w:p>
       <w:pPr>
-        <w:pStyle w:val="Heading2"/>
-      </w:pPr>
-      <w:bookmarkStart w:id="41" w:name="editor-notes"/>
-      <w:r>
-        <w:t xml:space="preserve">Editor notes</w:t>
+        <w:pStyle w:val="Heading1"/>
+      </w:pPr>
+      <w:bookmarkStart w:id="41" w:name="carsons-region-the-coulee-games"/>
+      <w:r>
+        <w:t xml:space="preserve">Carson’s Region, The Coulee Games</w:t>
       </w:r>
       <w:bookmarkEnd w:id="41"/>
     </w:p>
     <w:p>
       <w:pPr>
         <w:pStyle w:val="FirstParagraph"/>
-      </w:pPr>
-      <w:r>
-        <w:rPr>
-          <w:b/>
-        </w:rPr>
-        <w:t xml:space="preserve">On the</w:t>
-      </w:r>
-      <w:r>
-        <w:rPr>
-          <w:b/>
-        </w:rPr>
-        <w:t xml:space="preserve"> </w:t>
-      </w:r>
-      <w:r>
-        <w:rPr>
-          <w:b/>
-        </w:rPr>
-        <w:t xml:space="preserve">“</w:t>
-      </w:r>
-      <w:r>
-        <w:rPr>
-          <w:b/>
-        </w:rPr>
-        <w:t xml:space="preserve">cared-for moment</w:t>
-      </w:r>
-      <w:r>
-        <w:rPr>
-          <w:b/>
-        </w:rPr>
-        <w:t xml:space="preserve">”</w:t>
-      </w:r>
-      <w:r>
-        <w:rPr>
-          <w:b/>
-        </w:rPr>
-        <w:t xml:space="preserve"> </w:t>
-      </w:r>
-      <w:r>
-        <w:rPr>
-          <w:b/>
-        </w:rPr>
-        <w:t xml:space="preserve">(P-111):</w:t>
-      </w:r>
-      <w:r>
-        <w:t xml:space="preserve"> </w:t>
-      </w:r>
-      <w:r>
-        <w:t xml:space="preserve">The previous editor flagged that Madison risks becoming</w:t>
-      </w:r>
-      <w:r>
-        <w:t xml:space="preserve"> </w:t>
-      </w:r>
-      <w:r>
-        <w:t xml:space="preserve">“</w:t>
-      </w:r>
-      <w:r>
-        <w:t xml:space="preserve">the useful one.</w:t>
-      </w:r>
-      <w:r>
-        <w:t xml:space="preserve">”</w:t>
-      </w:r>
-      <w:r>
-        <w:t xml:space="preserve"> </w:t>
-      </w:r>
-      <w:r>
-        <w:t xml:space="preserve">P-111 fixes this. The Sisters take care of HER before she takes care of anyone else. It happens regardless of which path the reader picks. It is not earned. It is offered.</w:t>
-      </w:r>
-    </w:p>
-    <w:p>
-      <w:pPr>
-        <w:pStyle w:val="BodyText"/>
-      </w:pPr>
-      <w:r>
-        <w:rPr>
-          <w:b/>
-        </w:rPr>
-        <w:t xml:space="preserve">On the three paths:</w:t>
-      </w:r>
-      <w:r>
-        <w:t xml:space="preserve"> </w:t>
-      </w:r>
-      <w:r>
-        <w:t xml:space="preserve">Path A is the fast path, works for younger readers, gets you the basic Map, takes maybe 6 minutes to read aloud. Path B costs you time (Branch’s tea takes forty minutes in-world) but yields the enhanced Map AND a witness ally. Path C is the deepest, costs you nothing tangible but requires the reader to NOTICE WREN, which is the kind of choice Madison would actually make and the kind of empathy the book wants to reward.</w:t>
-      </w:r>
-    </w:p>
-    <w:p>
-      <w:pPr>
-        <w:pStyle w:val="BodyText"/>
-      </w:pPr>
-      <w:r>
-        <w:rPr>
-          <w:b/>
-        </w:rPr>
-        <w:t xml:space="preserve">On the Canyon Singer easter egg:</w:t>
-      </w:r>
-      <w:r>
-        <w:t xml:space="preserve"> </w:t>
-      </w:r>
-      <w:r>
-        <w:t xml:space="preserve">Reveal is deliberately oblique. Madison doesn’t know who the voice belongs to. The reader who knows the family lore (Madison &amp; Kellen’s mom singing across the lake one summer) gets the chill. The reader who doesn’t gets a beautiful mystery. Both work.</w:t>
-      </w:r>
-    </w:p>
-    <w:p>
-      <w:pPr>
-        <w:pStyle w:val="BodyText"/>
-      </w:pPr>
-      <w:r>
-        <w:rPr>
-          <w:b/>
-        </w:rPr>
-        <w:t xml:space="preserve">On the chosen-family theme:</w:t>
-      </w:r>
-      <w:r>
-        <w:t xml:space="preserve"> </w:t>
-      </w:r>
-      <w:r>
-        <w:t xml:space="preserve">The Lake Sisters’</w:t>
-      </w:r>
-      <w:r>
-        <w:t xml:space="preserve"> </w:t>
-      </w:r>
-      <w:r>
-        <w:t xml:space="preserve">“</w:t>
-      </w:r>
-      <w:r>
-        <w:t xml:space="preserve">the lake itself is family to us, which means it’s family to you</w:t>
-      </w:r>
-      <w:r>
-        <w:t xml:space="preserve">”</w:t>
-      </w:r>
-      <w:r>
-        <w:t xml:space="preserve"> </w:t>
-      </w:r>
-      <w:r>
-        <w:t xml:space="preserve">line lands in all three paths but with different weights. Path C makes it explicit (the song carries across worlds, the lake itself remembers the family). This is the seed of what Drystone will try to peel apart at the showdown.</w:t>
-      </w:r>
-    </w:p>
-    <w:p>
-      <w:pPr>
-        <w:pStyle w:val="BodyText"/>
-      </w:pPr>
-      <w:r>
-        <w:rPr>
-          <w:b/>
-        </w:rPr>
-        <w:t xml:space="preserve">On crossover hooks:</w:t>
-      </w:r>
-      <w:r>
-        <w:t xml:space="preserve"> </w:t>
-      </w:r>
-      <w:r>
-        <w:t xml:space="preserve">Path A has one Pegasus crossover ([CROSSOVER HOOK] tag). When we draft the other branches, similar small hooks should appear in each, Big Coulee’s cheers echoing from a valley, colored winds from Keira’s cliff, a frog herald passing through. Light touch only. One per region max.</w:t>
-      </w:r>
-    </w:p>
-    <w:p>
-      <w:pPr>
-        <w:pStyle w:val="BodyText"/>
-      </w:pPr>
-      <w:r>
-        <w:rPr>
-          <w:b/>
-        </w:rPr>
-        <w:t xml:space="preserve">On word count:</w:t>
-      </w:r>
-      <w:r>
-        <w:t xml:space="preserve"> </w:t>
-      </w:r>
-      <w:r>
-        <w:t xml:space="preserve">Total ~2,800 words across all passages. A reader who picks Path A reads about 1,500 of those words. A reader who picks Path C reads about 1,750. Path B reads about 1,700. None of the paths is dramatically longer than the others, the reader doesn’t feel</w:t>
-      </w:r>
-      <w:r>
-        <w:t xml:space="preserve"> </w:t>
-      </w:r>
-      <w:r>
-        <w:t xml:space="preserve">“</w:t>
-      </w:r>
-      <w:r>
-        <w:t xml:space="preserve">punished</w:t>
-      </w:r>
-      <w:r>
-        <w:t xml:space="preserve">”</w:t>
-      </w:r>
-      <w:r>
-        <w:t xml:space="preserve"> </w:t>
-      </w:r>
-      <w:r>
-        <w:t xml:space="preserve">for picking the short path.</w:t>
-      </w:r>
-    </w:p>
-    <w:p>
-      <w:pPr>
-        <w:pStyle w:val="BodyText"/>
-      </w:pPr>
-      <w:r>
-        <w:rPr>
-          <w:b/>
-        </w:rPr>
-        <w:t xml:space="preserve">On the wrapper variants:</w:t>
-      </w:r>
-      <w:r>
-        <w:t xml:space="preserve"> </w:t>
-      </w:r>
-      <w:r>
-        <w:t xml:space="preserve">I’ve added [VARIANT: STAY-TOGETHER / SPLIT / SOLO] tags at the key beats. These are conditional inserts, short paragraphs that swap in based on the reader’s Strategy choice. The skeleton stays the same. This is ho</w:t>
-      </w:r>
-      <w:r>
-        <w:t xml:space="preserve"> </w:t>
-      </w:r>
-      <w:r>
-        <w:t xml:space="preserve"># Carson’s Region, The Coulee Games</w:t>
-      </w:r>
-    </w:p>
-    <w:p>
-      <w:pPr>
-        <w:pStyle w:val="BodyText"/>
       </w:pPr>
       <w:r>
         <w:rPr>
@@ -6673,7 +6515,27 @@
         <w:pStyle w:val="BodyText"/>
       </w:pPr>
       <w:r>
-        <w:t xml:space="preserve">Big Coulee straightens up.</w:t>
+        <w:t xml:space="preserve">Big Coulee lowers her enormous head, eye level with Carson.</w:t>
+      </w:r>
+      <w:r>
+        <w:t xml:space="preserve"> </w:t>
+      </w:r>
+      <w:r>
+        <w:t xml:space="preserve">“</w:t>
+      </w:r>
+      <w:r>
+        <w:t xml:space="preserve">You are Carson the Trustworthy, child. People follow the loud ones because they have to. They follow you because they already wanted to. Remember that name.</w:t>
+      </w:r>
+      <w:r>
+        <w:t xml:space="preserve">”</w:t>
+      </w:r>
+    </w:p>
+    <w:p>
+      <w:pPr>
+        <w:pStyle w:val="BodyText"/>
+      </w:pPr>
+      <w:r>
+        <w:t xml:space="preserve">She straightens up.</w:t>
       </w:r>
       <w:r>
         <w:t xml:space="preserve"> </w:t>
@@ -8820,319 +8682,17 @@
     </w:p>
     <w:p>
       <w:pPr>
-        <w:pStyle w:val="Heading2"/>
-      </w:pPr>
-      <w:bookmarkStart w:id="50" w:name="editor-notes-1"/>
-      <w:r>
-        <w:t xml:space="preserve">Editor notes</w:t>
+        <w:pStyle w:val="Heading1"/>
+      </w:pPr>
+      <w:bookmarkStart w:id="50" w:name="reids-region-old-speaks-wood"/>
+      <w:r>
+        <w:t xml:space="preserve">Reid’s Region, Old Speak’s Wood</w:t>
       </w:r>
       <w:bookmarkEnd w:id="50"/>
     </w:p>
     <w:p>
       <w:pPr>
         <w:pStyle w:val="FirstParagraph"/>
-      </w:pPr>
-      <w:r>
-        <w:rPr>
-          <w:b/>
-        </w:rPr>
-        <w:t xml:space="preserve">On</w:t>
-      </w:r>
-      <w:r>
-        <w:rPr>
-          <w:b/>
-        </w:rPr>
-        <w:t xml:space="preserve"> </w:t>
-      </w:r>
-      <w:r>
-        <w:rPr>
-          <w:b/>
-        </w:rPr>
-        <w:t xml:space="preserve">“</w:t>
-      </w:r>
-      <w:r>
-        <w:rPr>
-          <w:b/>
-        </w:rPr>
-        <w:t xml:space="preserve">the go-hard moment</w:t>
-      </w:r>
-      <w:r>
-        <w:rPr>
-          <w:b/>
-        </w:rPr>
-        <w:t xml:space="preserve">”</w:t>
-      </w:r>
-      <w:r>
-        <w:rPr>
-          <w:b/>
-        </w:rPr>
-        <w:t xml:space="preserve"> </w:t>
-      </w:r>
-      <w:r>
-        <w:rPr>
-          <w:b/>
-        </w:rPr>
-        <w:t xml:space="preserve">(P-131):</w:t>
-      </w:r>
-      <w:r>
-        <w:t xml:space="preserve"> </w:t>
-      </w:r>
-      <w:r>
-        <w:t xml:space="preserve">This is Carson’s parallel to Madison’s float and Chayten’s demotion. Big Coulee specifically notices he’s been holding himself in, being polite, soft, careful, the way an older cousin learns to be, and gives him permission to compete for real. The cared-for thing for Carson is the opposite of comfort: it’s</w:t>
-      </w:r>
-      <w:r>
-        <w:t xml:space="preserve"> </w:t>
-      </w:r>
-      <w:r>
-        <w:rPr>
-          <w:i/>
-        </w:rPr>
-        <w:t xml:space="preserve">being asked to GO HARD without softening.</w:t>
-      </w:r>
-      <w:r>
-        <w:t xml:space="preserve"> </w:t>
-      </w:r>
-      <w:r>
-        <w:t xml:space="preserve">That’s what he never gets at home with the younger kids around.</w:t>
-      </w:r>
-    </w:p>
-    <w:p>
-      <w:pPr>
-        <w:pStyle w:val="BodyText"/>
-      </w:pPr>
-      <w:r>
-        <w:rPr>
-          <w:b/>
-        </w:rPr>
-        <w:t xml:space="preserve">On the competition-is-good editor note:</w:t>
-      </w:r>
-      <w:r>
-        <w:t xml:space="preserve"> </w:t>
-      </w:r>
-      <w:r>
-        <w:t xml:space="preserve">Big Coulee’s</w:t>
-      </w:r>
-      <w:r>
-        <w:t xml:space="preserve"> </w:t>
-      </w:r>
-      <w:r>
-        <w:t xml:space="preserve">“</w:t>
-      </w:r>
-      <w:r>
-        <w:t xml:space="preserve">thirty competitors all held back</w:t>
-      </w:r>
-      <w:r>
-        <w:t xml:space="preserve">”</w:t>
-      </w:r>
-      <w:r>
-        <w:t xml:space="preserve"> </w:t>
-      </w:r>
-      <w:r>
-        <w:t xml:space="preserve">speech directly addresses the previous editor’s flag. The book is saying out loud:</w:t>
-      </w:r>
-      <w:r>
-        <w:t xml:space="preserve"> </w:t>
-      </w:r>
-      <w:r>
-        <w:rPr>
-          <w:i/>
-        </w:rPr>
-        <w:t xml:space="preserve">holding back to be polite is its own kind of disrespect.</w:t>
-      </w:r>
-      <w:r>
-        <w:t xml:space="preserve"> </w:t>
-      </w:r>
-      <w:r>
-        <w:t xml:space="preserve">That’s a healthy message for competitive kids. Path A celebrates a full-effort losing race. Path B celebrates strategy. Path C celebrates noticing what matters more than the win. All three paths honor competition. None of them moralize against it.</w:t>
-      </w:r>
-    </w:p>
-    <w:p>
-      <w:pPr>
-        <w:pStyle w:val="BodyText"/>
-      </w:pPr>
-      <w:r>
-        <w:rPr>
-          <w:b/>
-        </w:rPr>
-        <w:t xml:space="preserve">On Tuft and Tumble:</w:t>
-      </w:r>
-      <w:r>
-        <w:t xml:space="preserve"> </w:t>
-      </w:r>
-      <w:r>
-        <w:t xml:space="preserve">They become physical allies on Path C, small enough that they’re</w:t>
-      </w:r>
-      <w:r>
-        <w:t xml:space="preserve"> </w:t>
-      </w:r>
-      <w:r>
-        <w:t xml:space="preserve">“</w:t>
-      </w:r>
-      <w:r>
-        <w:t xml:space="preserve">visible only to kids and Drystone</w:t>
-      </w:r>
-      <w:r>
-        <w:t xml:space="preserve">”</w:t>
-      </w:r>
-      <w:r>
-        <w:t xml:space="preserve"> </w:t>
-      </w:r>
-      <w:r>
-        <w:t xml:space="preserve">per the locked crossover rule. Big Coulee is huge and follows the same rule (Drystone sees a mammoth on the dock; the other adults see nothing). This is when Drystone starts to genuinely question his sanity.</w:t>
-      </w:r>
-    </w:p>
-    <w:p>
-      <w:pPr>
-        <w:pStyle w:val="BodyText"/>
-      </w:pPr>
-      <w:r>
-        <w:rPr>
-          <w:b/>
-        </w:rPr>
-        <w:t xml:space="preserve">On the chosen-family theme:</w:t>
-      </w:r>
-      <w:r>
-        <w:t xml:space="preserve"> </w:t>
-      </w:r>
-      <w:r>
-        <w:t xml:space="preserve">Big Coulee’s</w:t>
-      </w:r>
-      <w:r>
-        <w:t xml:space="preserve"> </w:t>
-      </w:r>
-      <w:r>
-        <w:t xml:space="preserve">“</w:t>
-      </w:r>
-      <w:r>
-        <w:t xml:space="preserve">I will look out for yours</w:t>
-      </w:r>
-      <w:r>
-        <w:t xml:space="preserve">”</w:t>
-      </w:r>
-      <w:r>
-        <w:t xml:space="preserve"> </w:t>
-      </w:r>
-      <w:r>
-        <w:t xml:space="preserve">line in Path C is a chosen-family beat with a non-human creature. The thematic argument is</w:t>
-      </w:r>
-      <w:r>
-        <w:t xml:space="preserve"> </w:t>
-      </w:r>
-      <w:r>
-        <w:rPr>
-          <w:i/>
-        </w:rPr>
-        <w:t xml:space="preserve">anyone who shows up for you becomes family.</w:t>
-      </w:r>
-      <w:r>
-        <w:t xml:space="preserve"> </w:t>
-      </w:r>
-      <w:r>
-        <w:t xml:space="preserve">This compounds with Madison’s Lake Sisters (</w:t>
-      </w:r>
-      <w:r>
-        <w:t xml:space="preserve">“</w:t>
-      </w:r>
-      <w:r>
-        <w:t xml:space="preserve">the lake itself is family to us</w:t>
-      </w:r>
-      <w:r>
-        <w:t xml:space="preserve">”</w:t>
-      </w:r>
-      <w:r>
-        <w:t xml:space="preserve">) and Chayten’s Otto (</w:t>
-      </w:r>
-      <w:r>
-        <w:t xml:space="preserve">“</w:t>
-      </w:r>
-      <w:r>
-        <w:t xml:space="preserve">we were not blood, we were better than blood</w:t>
-      </w:r>
-      <w:r>
-        <w:t xml:space="preserve">”</w:t>
-      </w:r>
-      <w:r>
-        <w:t xml:space="preserve">).</w:t>
-      </w:r>
-    </w:p>
-    <w:p>
-      <w:pPr>
-        <w:pStyle w:val="BodyText"/>
-      </w:pPr>
-      <w:r>
-        <w:rPr>
-          <w:b/>
-        </w:rPr>
-        <w:t xml:space="preserve">On crossovers:</w:t>
-      </w:r>
-      <w:r>
-        <w:t xml:space="preserve"> </w:t>
-      </w:r>
-      <w:r>
-        <w:t xml:space="preserve">Path A has a Madison hook (faint operatic note). Path C has an Aiden hook (Pegasus passing overhead with her rider). Light touch only.</w:t>
-      </w:r>
-    </w:p>
-    <w:p>
-      <w:pPr>
-        <w:pStyle w:val="BodyText"/>
-      </w:pPr>
-      <w:r>
-        <w:rPr>
-          <w:b/>
-        </w:rPr>
-        <w:t xml:space="preserve">On word count:</w:t>
-      </w:r>
-      <w:r>
-        <w:t xml:space="preserve"> </w:t>
-      </w:r>
-      <w:r>
-        <w:t xml:space="preserve">Total ~2,800. Path A reader: ~1,500. Path B: ~1,650. Path C: ~1,700. Same shape.</w:t>
-      </w:r>
-    </w:p>
-    <w:p>
-      <w:pPr>
-        <w:pStyle w:val="BodyText"/>
-      </w:pPr>
-      <w:r>
-        <w:rPr>
-          <w:b/>
-        </w:rPr>
-        <w:t xml:space="preserve">Open structural note:</w:t>
-      </w:r>
-      <w:r>
-        <w:t xml:space="preserve"> </w:t>
-      </w:r>
-      <w:r>
-        <w:t xml:space="preserve">I made Big Coulee’s pre-race</w:t>
-      </w:r>
-      <w:r>
-        <w:t xml:space="preserve"> </w:t>
-      </w:r>
-      <w:r>
-        <w:t xml:space="preserve">“</w:t>
-      </w:r>
-      <w:r>
-        <w:t xml:space="preserve">you’ve been holding yourself in</w:t>
-      </w:r>
-      <w:r>
-        <w:t xml:space="preserve">”</w:t>
-      </w:r>
-      <w:r>
-        <w:t xml:space="preserve"> </w:t>
-      </w:r>
-      <w:r>
-        <w:t xml:space="preserve">speech quite specific. If you’d rather it lands more lightly, less direct emotional content from the mammoth, more action, flag it and I’</w:t>
-      </w:r>
-      <w:r>
-        <w:t xml:space="preserve"> </w:t>
-      </w:r>
-      <w:r>
-        <w:t xml:space="preserve"># Reid’s Region, Old Speak’s Wood</w:t>
-      </w:r>
-    </w:p>
-    <w:p>
-      <w:pPr>
-        <w:pStyle w:val="BodyText"/>
       </w:pPr>
       <w:r>
         <w:rPr>
@@ -9871,6 +9431,26 @@
         <w:pStyle w:val="BodyText"/>
       </w:pPr>
       <w:r>
+        <w:t xml:space="preserve">Old Speak’s voice goes quieter still.</w:t>
+      </w:r>
+      <w:r>
+        <w:t xml:space="preserve"> </w:t>
+      </w:r>
+      <w:r>
+        <w:t xml:space="preserve">“</w:t>
+      </w:r>
+      <w:r>
+        <w:t xml:space="preserve">You are Reid the Noticer. The wood will remember that you saw. So will I.</w:t>
+      </w:r>
+      <w:r>
+        <w:t xml:space="preserve">”</w:t>
+      </w:r>
+    </w:p>
+    <w:p>
+      <w:pPr>
+        <w:pStyle w:val="BodyText"/>
+      </w:pPr>
+      <w:r>
         <w:t xml:space="preserve">Reid swallows.</w:t>
       </w:r>
     </w:p>
@@ -11409,219 +10989,13 @@
     </w:p>
     <w:p>
       <w:pPr>
-        <w:pStyle w:val="Heading2"/>
-      </w:pPr>
-      <w:bookmarkStart w:id="59" w:name="editor-notes-2"/>
-      <w:r>
-        <w:t xml:space="preserve">Editor notes</w:t>
+        <w:pStyle w:val="Heading1"/>
+      </w:pPr>
+      <w:bookmarkStart w:id="59" w:name="chaytens-region-the-driftwood-stage"/>
+      <w:r>
+        <w:t xml:space="preserve">Chayten’s Region, The Driftwood Stage</w:t>
       </w:r>
       <w:bookmarkEnd w:id="59"/>
-    </w:p>
-    <w:p>
-      <w:pPr>
-        <w:pStyle w:val="FirstParagraph"/>
-      </w:pPr>
-      <w:r>
-        <w:rPr>
-          <w:b/>
-        </w:rPr>
-        <w:t xml:space="preserve">On</w:t>
-      </w:r>
-      <w:r>
-        <w:rPr>
-          <w:b/>
-        </w:rPr>
-        <w:t xml:space="preserve"> </w:t>
-      </w:r>
-      <w:r>
-        <w:rPr>
-          <w:b/>
-        </w:rPr>
-        <w:t xml:space="preserve">“</w:t>
-      </w:r>
-      <w:r>
-        <w:rPr>
-          <w:b/>
-        </w:rPr>
-        <w:t xml:space="preserve">the just-sit moment</w:t>
-      </w:r>
-      <w:r>
-        <w:rPr>
-          <w:b/>
-        </w:rPr>
-        <w:t xml:space="preserve">”</w:t>
-      </w:r>
-      <w:r>
-        <w:rPr>
-          <w:b/>
-        </w:rPr>
-        <w:t xml:space="preserve"> </w:t>
-      </w:r>
-      <w:r>
-        <w:rPr>
-          <w:b/>
-        </w:rPr>
-        <w:t xml:space="preserve">(P-141):</w:t>
-      </w:r>
-      <w:r>
-        <w:t xml:space="preserve"> </w:t>
-      </w:r>
-      <w:r>
-        <w:t xml:space="preserve">Reid’s cared-for beat. Old Speak names what Reid does, quietly working, never making anyone ask, and tells him</w:t>
-      </w:r>
-      <w:r>
-        <w:t xml:space="preserve"> </w:t>
-      </w:r>
-      <w:r>
-        <w:rPr>
-          <w:i/>
-        </w:rPr>
-        <w:t xml:space="preserve">I see you. Most don’t.</w:t>
-      </w:r>
-      <w:r>
-        <w:t xml:space="preserve"> </w:t>
-      </w:r>
-      <w:r>
-        <w:t xml:space="preserve">That’s the gift Reid has never been given. The Listen bird sets the tone: the wood is full of beings who notice without speaking.</w:t>
-      </w:r>
-    </w:p>
-    <w:p>
-      <w:pPr>
-        <w:pStyle w:val="BodyText"/>
-      </w:pPr>
-      <w:r>
-        <w:rPr>
-          <w:b/>
-        </w:rPr>
-        <w:t xml:space="preserve">On the mythic-awe editor note:</w:t>
-      </w:r>
-      <w:r>
-        <w:t xml:space="preserve"> </w:t>
-      </w:r>
-      <w:r>
-        <w:t xml:space="preserve">Addressed in Path C. The driftwood is from the FIRST TREE of The Old Roar. Old Speak weeps amber sap. The staff</w:t>
-      </w:r>
-      <w:r>
-        <w:t xml:space="preserve"> </w:t>
-      </w:r>
-      <w:r>
-        <w:rPr>
-          <w:i/>
-        </w:rPr>
-        <w:t xml:space="preserve">roots</w:t>
-      </w:r>
-      <w:r>
-        <w:t xml:space="preserve"> </w:t>
-      </w:r>
-      <w:r>
-        <w:t xml:space="preserve">itself into the dock and holds the soil. This is the mythic register the previous editor asked for. Reid’s region is no longer just</w:t>
-      </w:r>
-      <w:r>
-        <w:t xml:space="preserve"> </w:t>
-      </w:r>
-      <w:r>
-        <w:t xml:space="preserve">“</w:t>
-      </w:r>
-      <w:r>
-        <w:t xml:space="preserve">calm</w:t>
-      </w:r>
-      <w:r>
-        <w:t xml:space="preserve">”</w:t>
-      </w:r>
-      <w:r>
-        <w:t xml:space="preserve">, it’s</w:t>
-      </w:r>
-      <w:r>
-        <w:t xml:space="preserve"> </w:t>
-      </w:r>
-      <w:r>
-        <w:rPr>
-          <w:i/>
-        </w:rPr>
-        <w:t xml:space="preserve">ancient</w:t>
-      </w:r>
-      <w:r>
-        <w:t xml:space="preserve"> </w:t>
-      </w:r>
-      <w:r>
-        <w:t xml:space="preserve">and</w:t>
-      </w:r>
-      <w:r>
-        <w:t xml:space="preserve"> </w:t>
-      </w:r>
-      <w:r>
-        <w:rPr>
-          <w:i/>
-        </w:rPr>
-        <w:t xml:space="preserve">huge.</w:t>
-      </w:r>
-      <w:r>
-        <w:t xml:space="preserve"> </w:t>
-      </w:r>
-      <w:r>
-        <w:t xml:space="preserve">Path A keeps the calm honest-craft register for readers who want it lighter.</w:t>
-      </w:r>
-    </w:p>
-    <w:p>
-      <w:pPr>
-        <w:pStyle w:val="BodyText"/>
-      </w:pPr>
-      <w:r>
-        <w:rPr>
-          <w:b/>
-        </w:rPr>
-        <w:t xml:space="preserve">On DockHealing flag:</w:t>
-      </w:r>
-      <w:r>
-        <w:t xml:space="preserve"> </w:t>
-      </w:r>
-      <w:r>
-        <w:t xml:space="preserve">Locked into Path C. The coda mechanic from the v2 draft (Reid plants the staff at the base of the third piling and the dock heals overnight) now requires the reader to have earned the FULL staff. CROWN ending playthroughs always include this. SILVER ending playthroughs may not. That’s the right level of consequence.</w:t>
-      </w:r>
-    </w:p>
-    <w:p>
-      <w:pPr>
-        <w:pStyle w:val="BodyText"/>
-      </w:pPr>
-      <w:r>
-        <w:rPr>
-          <w:b/>
-        </w:rPr>
-        <w:t xml:space="preserve">On crossovers:</w:t>
-      </w:r>
-      <w:r>
-        <w:t xml:space="preserve"> </w:t>
-      </w:r>
-      <w:r>
-        <w:t xml:space="preserve">Path A: Carson’s mammoth rumble. Path B: Madison’s Canyon Singer. Path C: Aiden’s Pegasus. Three different crossovers across three paths gives the reader a different sense of the world being alive depending on what they pick.</w:t>
-      </w:r>
-    </w:p>
-    <w:p>
-      <w:pPr>
-        <w:pStyle w:val="BodyText"/>
-      </w:pPr>
-      <w:r>
-        <w:rPr>
-          <w:b/>
-        </w:rPr>
-        <w:t xml:space="preserve">On word count:</w:t>
-      </w:r>
-      <w:r>
-        <w:t xml:space="preserve"> </w:t>
-      </w:r>
-      <w:r>
-        <w:t xml:space="preserve">Total ~2,600. Lighter than Madison/Chayten/Carson because Reid’s region IS quieter and tightening matches the character.</w:t>
-      </w:r>
-    </w:p>
-    <w:p>
-      <w:pPr>
-        <w:pStyle w:val="Heading1"/>
-      </w:pPr>
-      <w:bookmarkStart w:id="60" w:name="chaytens-region-the-driftwood-stage"/>
-      <w:r>
-        <w:t xml:space="preserve">Chayten’s Region, The Driftwood Stage</w:t>
-      </w:r>
-      <w:bookmarkEnd w:id="60"/>
     </w:p>
     <w:p>
       <w:pPr>
@@ -11726,11 +11100,11 @@
       <w:pPr>
         <w:pStyle w:val="Heading2"/>
       </w:pPr>
-      <w:bookmarkStart w:id="61" w:name="structure-overview-4"/>
+      <w:bookmarkStart w:id="60" w:name="structure-overview-4"/>
       <w:r>
         <w:t xml:space="preserve">Structure overview</w:t>
       </w:r>
-      <w:bookmarkEnd w:id="61"/>
+      <w:bookmarkEnd w:id="60"/>
     </w:p>
     <w:p>
       <w:pPr>
@@ -11843,11 +11217,11 @@
       <w:pPr>
         <w:pStyle w:val="Heading2"/>
       </w:pPr>
-      <w:bookmarkStart w:id="62" w:name="p-120-arrival-at-the-driftwood-stage"/>
+      <w:bookmarkStart w:id="61" w:name="p-120-arrival-at-the-driftwood-stage"/>
       <w:r>
         <w:t xml:space="preserve">P-120, ARRIVAL AT THE DRIFTWOOD STAGE</w:t>
       </w:r>
-      <w:bookmarkEnd w:id="62"/>
+      <w:bookmarkEnd w:id="61"/>
     </w:p>
     <w:p>
       <w:pPr>
@@ -12068,11 +11442,11 @@
       <w:pPr>
         <w:pStyle w:val="Heading2"/>
       </w:pPr>
-      <w:bookmarkStart w:id="63" w:name="p-121-the-be-a-kid-moment"/>
+      <w:bookmarkStart w:id="62" w:name="p-121-the-be-a-kid-moment"/>
       <w:r>
         <w:t xml:space="preserve">P-121, THE BE-A-KID MOMENT</w:t>
       </w:r>
-      <w:bookmarkEnd w:id="63"/>
+      <w:bookmarkEnd w:id="62"/>
     </w:p>
     <w:p>
       <w:pPr>
@@ -12489,11 +11863,25 @@
         <w:pStyle w:val="BodyText"/>
       </w:pPr>
       <w:r>
-        <w:t xml:space="preserve">Otto stands up.</w:t>
-      </w:r>
-      <w:r>
-        <w:t xml:space="preserve"> </w:t>
-      </w:r>
+        <w:t xml:space="preserve">Otto stands slowly.</w:t>
+      </w:r>
+      <w:r>
+        <w:t xml:space="preserve"> </w:t>
+      </w:r>
+      <w:r>
+        <w:t xml:space="preserve">“</w:t>
+      </w:r>
+      <w:r>
+        <w:t xml:space="preserve">And one more thing, child. You are Chayten the Connector. The one who sits with people because they need someone to sit with them. That is rarer than the world tells you. Remember the name.</w:t>
+      </w:r>
+      <w:r>
+        <w:t xml:space="preserve">”</w:t>
+      </w:r>
+    </w:p>
+    <w:p>
+      <w:pPr>
+        <w:pStyle w:val="BodyText"/>
+      </w:pPr>
       <w:r>
         <w:t xml:space="preserve">“</w:t>
       </w:r>
@@ -12524,11 +11912,11 @@
       <w:pPr>
         <w:pStyle w:val="Heading2"/>
       </w:pPr>
-      <w:bookmarkStart w:id="64" w:name="p-122-chaytens-choice"/>
+      <w:bookmarkStart w:id="63" w:name="p-122-chaytens-choice"/>
       <w:r>
         <w:t xml:space="preserve">P-122, CHAYTEN’S CHOICE</w:t>
       </w:r>
-      <w:bookmarkEnd w:id="64"/>
+      <w:bookmarkEnd w:id="63"/>
     </w:p>
     <w:p>
       <w:pPr>
@@ -12657,11 +12045,11 @@
       <w:pPr>
         <w:pStyle w:val="Heading2"/>
       </w:pPr>
-      <w:bookmarkStart w:id="65" w:name="p-123-path-a-take-the-script-base"/>
+      <w:bookmarkStart w:id="64" w:name="p-123-path-a-take-the-script-base"/>
       <w:r>
         <w:t xml:space="preserve">P-123, PATH A: TAKE THE SCRIPT (BASE)</w:t>
       </w:r>
-      <w:bookmarkEnd w:id="65"/>
+      <w:bookmarkEnd w:id="64"/>
     </w:p>
     <w:p>
       <w:pPr>
@@ -13065,11 +12453,11 @@
       <w:pPr>
         <w:pStyle w:val="Heading2"/>
       </w:pPr>
-      <w:bookmarkStart w:id="66" w:name="Xca0c87e9aa9c223858c81c4508770b9ff43ff91"/>
+      <w:bookmarkStart w:id="65" w:name="Xca0c87e9aa9c223858c81c4508770b9ff43ff91"/>
       <w:r>
         <w:t xml:space="preserve">P-124, PATH B: ASK WHAT THE PLAY IS ABOUT (ENHANCED)</w:t>
       </w:r>
-      <w:bookmarkEnd w:id="66"/>
+      <w:bookmarkEnd w:id="65"/>
     </w:p>
     <w:p>
       <w:pPr>
@@ -13587,11 +12975,11 @@
       <w:pPr>
         <w:pStyle w:val="Heading2"/>
       </w:pPr>
-      <w:bookmarkStart w:id="67" w:name="p-125-path-c-notice-pickle-first-hidden"/>
+      <w:bookmarkStart w:id="66" w:name="p-125-path-c-notice-pickle-first-hidden"/>
       <w:r>
         <w:t xml:space="preserve">P-125, PATH C: NOTICE PICKLE FIRST (HIDDEN)</w:t>
       </w:r>
-      <w:bookmarkEnd w:id="67"/>
+      <w:bookmarkEnd w:id="66"/>
     </w:p>
     <w:p>
       <w:pPr>
@@ -14316,11 +13704,11 @@
       <w:pPr>
         <w:pStyle w:val="Heading2"/>
       </w:pPr>
-      <w:bookmarkStart w:id="68" w:name="p-126-exit-the-troupe-sees-her-off"/>
+      <w:bookmarkStart w:id="67" w:name="p-126-exit-the-troupe-sees-her-off"/>
       <w:r>
         <w:t xml:space="preserve">P-126, EXIT: THE TROUPE SEES HER OFF</w:t>
       </w:r>
-      <w:bookmarkEnd w:id="68"/>
+      <w:bookmarkEnd w:id="67"/>
     </w:p>
     <w:p>
       <w:pPr>
@@ -14505,371 +13893,17 @@
     </w:p>
     <w:p>
       <w:pPr>
-        <w:pStyle w:val="Heading2"/>
-      </w:pPr>
-      <w:bookmarkStart w:id="69" w:name="editor-notes-3"/>
-      <w:r>
-        <w:t xml:space="preserve">Editor notes</w:t>
-      </w:r>
-      <w:bookmarkEnd w:id="69"/>
+        <w:pStyle w:val="Heading1"/>
+      </w:pPr>
+      <w:bookmarkStart w:id="68" w:name="kellens-region-skip-stone-lake"/>
+      <w:r>
+        <w:t xml:space="preserve">Kellen’s Region, Skip-Stone Lake</w:t>
+      </w:r>
+      <w:bookmarkEnd w:id="68"/>
     </w:p>
     <w:p>
       <w:pPr>
         <w:pStyle w:val="FirstParagraph"/>
-      </w:pPr>
-      <w:r>
-        <w:rPr>
-          <w:b/>
-        </w:rPr>
-        <w:t xml:space="preserve">On</w:t>
-      </w:r>
-      <w:r>
-        <w:rPr>
-          <w:b/>
-        </w:rPr>
-        <w:t xml:space="preserve"> </w:t>
-      </w:r>
-      <w:r>
-        <w:rPr>
-          <w:b/>
-        </w:rPr>
-        <w:t xml:space="preserve">“</w:t>
-      </w:r>
-      <w:r>
-        <w:rPr>
-          <w:b/>
-        </w:rPr>
-        <w:t xml:space="preserve">the be-a-kid moment</w:t>
-      </w:r>
-      <w:r>
-        <w:rPr>
-          <w:b/>
-        </w:rPr>
-        <w:t xml:space="preserve">”</w:t>
-      </w:r>
-      <w:r>
-        <w:rPr>
-          <w:b/>
-        </w:rPr>
-        <w:t xml:space="preserve"> </w:t>
-      </w:r>
-      <w:r>
-        <w:rPr>
-          <w:b/>
-        </w:rPr>
-        <w:t xml:space="preserve">(P-121):</w:t>
-      </w:r>
-      <w:r>
-        <w:t xml:space="preserve"> </w:t>
-      </w:r>
-      <w:r>
-        <w:t xml:space="preserve">This is Chayten’s parallel to Madison’s float. The structural rule: every region has one passage where the focal kid gets to be a</w:t>
-      </w:r>
-      <w:r>
-        <w:t xml:space="preserve"> </w:t>
-      </w:r>
-      <w:r>
-        <w:rPr>
-          <w:i/>
-        </w:rPr>
-        <w:t xml:space="preserve">person</w:t>
-      </w:r>
-      <w:r>
-        <w:t xml:space="preserve">, not a role, before the task begins. Otto sees Chayten holding herself like a chaperone and explicitly demotes her:</w:t>
-      </w:r>
-      <w:r>
-        <w:t xml:space="preserve"> </w:t>
-      </w:r>
-      <w:r>
-        <w:t xml:space="preserve">“</w:t>
-      </w:r>
-      <w:r>
-        <w:t xml:space="preserve">for one hour, you are an actor.</w:t>
-      </w:r>
-      <w:r>
-        <w:t xml:space="preserve">”</w:t>
-      </w:r>
-      <w:r>
-        <w:t xml:space="preserve"> </w:t>
-      </w:r>
-      <w:r>
-        <w:t xml:space="preserve">This addresses the editor note that Chayten risks being</w:t>
-      </w:r>
-      <w:r>
-        <w:t xml:space="preserve"> </w:t>
-      </w:r>
-      <w:r>
-        <w:t xml:space="preserve">“</w:t>
-      </w:r>
-      <w:r>
-        <w:t xml:space="preserve">valued for what she does, not who she is.</w:t>
-      </w:r>
-      <w:r>
-        <w:t xml:space="preserve">”</w:t>
-      </w:r>
-    </w:p>
-    <w:p>
-      <w:pPr>
-        <w:pStyle w:val="BodyText"/>
-      </w:pPr>
-      <w:r>
-        <w:rPr>
-          <w:b/>
-        </w:rPr>
-        <w:t xml:space="preserve">On the play’s content:</w:t>
-      </w:r>
-      <w:r>
-        <w:t xml:space="preserve"> </w:t>
-      </w:r>
-      <w:r>
-        <w:t xml:space="preserve">“</w:t>
-      </w:r>
-      <w:r>
-        <w:t xml:space="preserve">The Tale of the Lost Brother</w:t>
-      </w:r>
-      <w:r>
-        <w:t xml:space="preserve">”</w:t>
-      </w:r>
-      <w:r>
-        <w:t xml:space="preserve"> </w:t>
-      </w:r>
-      <w:r>
-        <w:t xml:space="preserve">is a chosen-family story in Paths B and C. Otto’s brother was not blood. They were brothers anyway. This is the same thematic seed Madison’s Lake Sisters planted (</w:t>
-      </w:r>
-      <w:r>
-        <w:t xml:space="preserve">“</w:t>
-      </w:r>
-      <w:r>
-        <w:t xml:space="preserve">the lake is family</w:t>
-      </w:r>
-      <w:r>
-        <w:t xml:space="preserve">”</w:t>
-      </w:r>
-      <w:r>
-        <w:t xml:space="preserve">), Chayten’s region waters it. By the time we get to the showdown, the chosen-family vs blood-family theme has been hit in two regions without ever being lectured about.</w:t>
-      </w:r>
-    </w:p>
-    <w:p>
-      <w:pPr>
-        <w:pStyle w:val="BodyText"/>
-      </w:pPr>
-      <w:r>
-        <w:rPr>
-          <w:b/>
-        </w:rPr>
-        <w:t xml:space="preserve">On Pickle (Path C):</w:t>
-      </w:r>
-      <w:r>
-        <w:t xml:space="preserve"> </w:t>
-      </w:r>
-      <w:r>
-        <w:t xml:space="preserve">Pickle is the deepest payoff. She is the small one Chayten</w:t>
-      </w:r>
-      <w:r>
-        <w:t xml:space="preserve"> </w:t>
-      </w:r>
-      <w:r>
-        <w:rPr>
-          <w:i/>
-        </w:rPr>
-        <w:t xml:space="preserve">sees</w:t>
-      </w:r>
-      <w:r>
-        <w:t xml:space="preserve"> </w:t>
-      </w:r>
-      <w:r>
-        <w:t xml:space="preserve">before she sees her own opportunity. The Stones explicitly say</w:t>
-      </w:r>
-      <w:r>
-        <w:t xml:space="preserve"> </w:t>
-      </w:r>
-      <w:r>
-        <w:t xml:space="preserve">“</w:t>
-      </w:r>
-      <w:r>
-        <w:rPr>
-          <w:b/>
-        </w:rPr>
-        <w:t xml:space="preserve">SHE SAW THE SMALL ONE FIRST. THAT IS A REAL THING.</w:t>
-      </w:r>
-      <w:r>
-        <w:t xml:space="preserve">”</w:t>
-      </w:r>
-      <w:r>
-        <w:t xml:space="preserve"> </w:t>
-      </w:r>
-      <w:r>
-        <w:t xml:space="preserve">That is the editor’s note,</w:t>
-      </w:r>
-      <w:r>
-        <w:t xml:space="preserve"> </w:t>
-      </w:r>
-      <w:r>
-        <w:t xml:space="preserve">“</w:t>
-      </w:r>
-      <w:r>
-        <w:t xml:space="preserve">make sure one character explicitly values her presence, not her performance</w:t>
-      </w:r>
-      <w:r>
-        <w:t xml:space="preserve">”</w:t>
-      </w:r>
-      <w:r>
-        <w:t xml:space="preserve">, delivered by the most ancient audience in the world. The capital letters are deliberate; the Stones are huge.</w:t>
-      </w:r>
-    </w:p>
-    <w:p>
-      <w:pPr>
-        <w:pStyle w:val="BodyText"/>
-      </w:pPr>
-      <w:r>
-        <w:rPr>
-          <w:b/>
-        </w:rPr>
-        <w:t xml:space="preserve">On the new ending Chayten writes (Path B):</w:t>
-      </w:r>
-      <w:r>
-        <w:t xml:space="preserve"> </w:t>
-      </w:r>
-      <w:r>
-        <w:t xml:space="preserve">Otto has played the play 712 times always landing on</w:t>
-      </w:r>
-      <w:r>
-        <w:t xml:space="preserve"> </w:t>
-      </w:r>
-      <w:r>
-        <w:t xml:space="preserve">“</w:t>
-      </w:r>
-      <w:r>
-        <w:rPr>
-          <w:i/>
-        </w:rPr>
-        <w:t xml:space="preserve">you came home.</w:t>
-      </w:r>
-      <w:r>
-        <w:t xml:space="preserve">”</w:t>
-      </w:r>
-      <w:r>
-        <w:t xml:space="preserve"> </w:t>
-      </w:r>
-      <w:r>
-        <w:t xml:space="preserve">Chayten changes it to</w:t>
-      </w:r>
-      <w:r>
-        <w:t xml:space="preserve"> </w:t>
-      </w:r>
-      <w:r>
-        <w:t xml:space="preserve">“</w:t>
-      </w:r>
-      <w:r>
-        <w:rPr>
-          <w:i/>
-        </w:rPr>
-        <w:t xml:space="preserve">you were always with me.</w:t>
-      </w:r>
-      <w:r>
-        <w:t xml:space="preserve">”</w:t>
-      </w:r>
-      <w:r>
-        <w:t xml:space="preserve"> </w:t>
-      </w:r>
-      <w:r>
-        <w:t xml:space="preserve">This is a real-life rewrite of grief. It also previews how the showdown will work, the kids don’t BEAT the adults’ problem. They reframe what’s possible.</w:t>
-      </w:r>
-    </w:p>
-    <w:p>
-      <w:pPr>
-        <w:pStyle w:val="BodyText"/>
-      </w:pPr>
-      <w:r>
-        <w:rPr>
-          <w:b/>
-        </w:rPr>
-        <w:t xml:space="preserve">On crossovers:</w:t>
-      </w:r>
-      <w:r>
-        <w:t xml:space="preserve"> </w:t>
-      </w:r>
-      <w:r>
-        <w:t xml:space="preserve">Path A has a Madison crossover (the small otter hears a woman singing on water). Path C has an Aiden crossover (the moss-lights make a unicorn shape on the ceiling). Both are quiet enough to miss; the reader who’s played other branches gets the gift.</w:t>
-      </w:r>
-    </w:p>
-    <w:p>
-      <w:pPr>
-        <w:pStyle w:val="BodyText"/>
-      </w:pPr>
-      <w:r>
-        <w:rPr>
-          <w:b/>
-        </w:rPr>
-        <w:t xml:space="preserve">On Pickle as an ally:</w:t>
-      </w:r>
-      <w:r>
-        <w:t xml:space="preserve"> </w:t>
-      </w:r>
-      <w:r>
-        <w:t xml:space="preserve">Pickle goes to the showdown if you took Path C. She perches on Chayten’s shoulder. She does not speak. But when Drystone tries to dismiss the kids, Pickle hisses at him, and an adult in the crowd hears a sound they can’t quite locate, and decides Drystone is suddenly less credible. Quiet but real.</w:t>
-      </w:r>
-    </w:p>
-    <w:p>
-      <w:pPr>
-        <w:pStyle w:val="BodyText"/>
-      </w:pPr>
-      <w:r>
-        <w:rPr>
-          <w:b/>
-        </w:rPr>
-        <w:t xml:space="preserve">On wrapper variants:</w:t>
-      </w:r>
-      <w:r>
-        <w:t xml:space="preserve"> </w:t>
-      </w:r>
-      <w:r>
-        <w:t xml:space="preserve">Same approach as Madison, short conditional inserts at key beats. Aiden being PRESENT or ABSENT in the wrapper matters more for Chayten than for any other region, because the play she ends up in is about a lost brother. The SOLO variant where Aiden is somewhere else hits harder.</w:t>
-      </w:r>
-    </w:p>
-    <w:p>
-      <w:pPr>
-        <w:pStyle w:val="BodyText"/>
-      </w:pPr>
-      <w:r>
-        <w:rPr>
-          <w:b/>
-        </w:rPr>
-        <w:t xml:space="preserve">On word count:</w:t>
-      </w:r>
-      <w:r>
-        <w:t xml:space="preserve"> </w:t>
-      </w:r>
-      <w:r>
-        <w:t xml:space="preserve">Total ~2,800 words. Path A reader: ~1,500. Path B: ~1,700. Path C: ~1,750. Same shape as Madison’s region.</w:t>
-      </w:r>
-    </w:p>
-    <w:p>
-      <w:pPr>
-        <w:pStyle w:val="BodyText"/>
-      </w:pPr>
-      <w:r>
-        <w:rPr>
-          <w:b/>
-        </w:rPr>
-        <w:t xml:space="preserve">Open structural question:</w:t>
-      </w:r>
-      <w:r>
-        <w:t xml:space="preserve"> </w:t>
-      </w:r>
-      <w:r>
-        <w:t xml:space="preserve">I made Otto LEAVE The Old Roar to come to the showdown in Path B. This is a precedent, does any creature get to physically cross over with the kids, or is Pegasus the only one? If Otto can come, can Branch (Madison’s ally)? Can Big Coulee? I think the answer is *only allies yo</w:t>
-      </w:r>
-      <w:r>
-        <w:t xml:space="preserve"> </w:t>
-      </w:r>
-      <w:r>
-        <w:t xml:space="preserve"># Kellen’s Region, Skip-Stone Lake</w:t>
-      </w:r>
-    </w:p>
-    <w:p>
-      <w:pPr>
-        <w:pStyle w:val="BodyText"/>
       </w:pPr>
       <w:r>
         <w:rPr>
@@ -14970,11 +14004,11 @@
       <w:pPr>
         <w:pStyle w:val="Heading2"/>
       </w:pPr>
-      <w:bookmarkStart w:id="70" w:name="structure-overview-5"/>
+      <w:bookmarkStart w:id="69" w:name="structure-overview-5"/>
       <w:r>
         <w:t xml:space="preserve">Structure overview</w:t>
       </w:r>
-      <w:bookmarkEnd w:id="70"/>
+      <w:bookmarkEnd w:id="69"/>
     </w:p>
     <w:p>
       <w:pPr>
@@ -15060,11 +14094,11 @@
       <w:pPr>
         <w:pStyle w:val="Heading2"/>
       </w:pPr>
-      <w:bookmarkStart w:id="71" w:name="p-150-arrival-at-skip-stone-lake"/>
+      <w:bookmarkStart w:id="70" w:name="p-150-arrival-at-skip-stone-lake"/>
       <w:r>
         <w:t xml:space="preserve">P-150, ARRIVAL AT SKIP-STONE LAKE</w:t>
       </w:r>
-      <w:bookmarkEnd w:id="71"/>
+      <w:bookmarkEnd w:id="70"/>
     </w:p>
     <w:p>
       <w:pPr>
@@ -15421,11 +14455,11 @@
       <w:pPr>
         <w:pStyle w:val="Heading2"/>
       </w:pPr>
-      <w:bookmarkStart w:id="72" w:name="p-151-the-whole-self-moment"/>
+      <w:bookmarkStart w:id="71" w:name="p-151-the-whole-self-moment"/>
       <w:r>
         <w:t xml:space="preserve">P-151, THE WHOLE-SELF MOMENT</w:t>
       </w:r>
-      <w:bookmarkEnd w:id="72"/>
+      <w:bookmarkEnd w:id="71"/>
     </w:p>
     <w:p>
       <w:pPr>
@@ -15702,6 +14736,26 @@
       </w:r>
       <w:r>
         <w:t xml:space="preserve">he says. He means it this time.</w:t>
+      </w:r>
+    </w:p>
+    <w:p>
+      <w:pPr>
+        <w:pStyle w:val="BodyText"/>
+      </w:pPr>
+      <w:r>
+        <w:t xml:space="preserve">Skim hops back another step. Her voice goes formal.</w:t>
+      </w:r>
+      <w:r>
+        <w:t xml:space="preserve"> </w:t>
+      </w:r>
+      <w:r>
+        <w:t xml:space="preserve">“</w:t>
+      </w:r>
+      <w:r>
+        <w:t xml:space="preserve">You are Kellen the Whole, child. The kid who plays with both halves of himself at once. We do not see many of you. Carry that name.</w:t>
+      </w:r>
+      <w:r>
+        <w:t xml:space="preserve">”</w:t>
       </w:r>
     </w:p>
     <w:p>
@@ -15723,11 +14777,11 @@
       <w:pPr>
         <w:pStyle w:val="Heading2"/>
       </w:pPr>
-      <w:bookmarkStart w:id="73" w:name="p-152-kellens-choice"/>
+      <w:bookmarkStart w:id="72" w:name="p-152-kellens-choice"/>
       <w:r>
         <w:t xml:space="preserve">P-152, KELLEN’S CHOICE</w:t>
       </w:r>
-      <w:bookmarkEnd w:id="73"/>
+      <w:bookmarkEnd w:id="72"/>
     </w:p>
     <w:p>
       <w:pPr>
@@ -15941,11 +14995,11 @@
       <w:pPr>
         <w:pStyle w:val="Heading2"/>
       </w:pPr>
-      <w:bookmarkStart w:id="74" w:name="Xc3b7110814def03c18cd5c9ace1a7d3e5c9e4c7"/>
+      <w:bookmarkStart w:id="73" w:name="Xc3b7110814def03c18cd5c9ace1a7d3e5c9e4c7"/>
       <w:r>
         <w:t xml:space="preserve">P-153, PATH A: PLAY THE SEVEN PATTERNS (BASE)</w:t>
       </w:r>
-      <w:bookmarkEnd w:id="74"/>
+      <w:bookmarkEnd w:id="73"/>
     </w:p>
     <w:p>
       <w:pPr>
@@ -16310,11 +15364,11 @@
       <w:pPr>
         <w:pStyle w:val="Heading2"/>
       </w:pPr>
-      <w:bookmarkStart w:id="75" w:name="Xd8c02cfc1f19a81b30acc93e3401464244c181e"/>
+      <w:bookmarkStart w:id="74" w:name="Xd8c02cfc1f19a81b30acc93e3401464244c181e"/>
       <w:r>
         <w:t xml:space="preserve">P-154, PATH B: ASK SKIM TO GO FIRST (ENHANCED)</w:t>
       </w:r>
-      <w:bookmarkEnd w:id="75"/>
+      <w:bookmarkEnd w:id="74"/>
     </w:p>
     <w:p>
       <w:pPr>
@@ -16762,11 +15816,11 @@
       <w:pPr>
         <w:pStyle w:val="Heading2"/>
       </w:pPr>
-      <w:bookmarkStart w:id="76" w:name="p-155-path-c-invent-a-new-pattern-hidden"/>
+      <w:bookmarkStart w:id="75" w:name="p-155-path-c-invent-a-new-pattern-hidden"/>
       <w:r>
         <w:t xml:space="preserve">P-155, PATH C: INVENT A NEW PATTERN (HIDDEN)</w:t>
       </w:r>
-      <w:bookmarkEnd w:id="76"/>
+      <w:bookmarkEnd w:id="75"/>
     </w:p>
     <w:p>
       <w:pPr>
@@ -17337,11 +16391,11 @@
       <w:pPr>
         <w:pStyle w:val="Heading2"/>
       </w:pPr>
-      <w:bookmarkStart w:id="77" w:name="p-156-exit"/>
+      <w:bookmarkStart w:id="76" w:name="p-156-exit"/>
       <w:r>
         <w:t xml:space="preserve">P-156, EXIT</w:t>
       </w:r>
-      <w:bookmarkEnd w:id="77"/>
+      <w:bookmarkEnd w:id="76"/>
     </w:p>
     <w:p>
       <w:pPr>
@@ -17619,210 +16673,13 @@
     </w:p>
     <w:p>
       <w:pPr>
-        <w:pStyle w:val="Heading2"/>
-      </w:pPr>
-      <w:bookmarkStart w:id="78" w:name="editor-notes-4"/>
-      <w:r>
-        <w:t xml:space="preserve">Editor notes</w:t>
-      </w:r>
-      <w:bookmarkEnd w:id="78"/>
-    </w:p>
-    <w:p>
-      <w:pPr>
-        <w:pStyle w:val="FirstParagraph"/>
-      </w:pPr>
-      <w:r>
-        <w:rPr>
-          <w:b/>
-        </w:rPr>
-        <w:t xml:space="preserve">On</w:t>
-      </w:r>
-      <w:r>
-        <w:rPr>
-          <w:b/>
-        </w:rPr>
-        <w:t xml:space="preserve"> </w:t>
-      </w:r>
-      <w:r>
-        <w:rPr>
-          <w:b/>
-        </w:rPr>
-        <w:t xml:space="preserve">“</w:t>
-      </w:r>
-      <w:r>
-        <w:rPr>
-          <w:b/>
-        </w:rPr>
-        <w:t xml:space="preserve">the whole-self moment</w:t>
-      </w:r>
-      <w:r>
-        <w:rPr>
-          <w:b/>
-        </w:rPr>
-        <w:t xml:space="preserve">”</w:t>
-      </w:r>
-      <w:r>
-        <w:rPr>
-          <w:b/>
-        </w:rPr>
-        <w:t xml:space="preserve"> </w:t>
-      </w:r>
-      <w:r>
-        <w:rPr>
-          <w:b/>
-        </w:rPr>
-        <w:t xml:space="preserve">(P-151):</w:t>
-      </w:r>
-      <w:r>
-        <w:t xml:space="preserve"> </w:t>
-      </w:r>
-      <w:r>
-        <w:t xml:space="preserve">Kellen’s cared-for beat. Skim names what most adults miss: kids hide a half of themselves to avoid being teased. She tells him to play with ALL of him.</w:t>
-      </w:r>
-      <w:r>
-        <w:t xml:space="preserve"> </w:t>
-      </w:r>
-      <w:r>
-        <w:rPr>
-          <w:i/>
-        </w:rPr>
-        <w:t xml:space="preserve">Eyes, hands, thinking, instinct. The whole kid.</w:t>
-      </w:r>
-      <w:r>
-        <w:t xml:space="preserve"> </w:t>
-      </w:r>
-      <w:r>
-        <w:t xml:space="preserve">This is also a direct fix for the previous editor’s note, the book doesn’t frame his intelligence as a</w:t>
-      </w:r>
-      <w:r>
-        <w:t xml:space="preserve"> </w:t>
-      </w:r>
-      <w:r>
-        <w:t xml:space="preserve">“</w:t>
-      </w:r>
-      <w:r>
-        <w:t xml:space="preserve">surprise reveal.</w:t>
-      </w:r>
-      <w:r>
-        <w:t xml:space="preserve">”</w:t>
-      </w:r>
-      <w:r>
-        <w:t xml:space="preserve"> </w:t>
-      </w:r>
-      <w:r>
-        <w:t xml:space="preserve">It names it from the start as one of his two halves, and Skim’s gift is permission to use both.</w:t>
-      </w:r>
-    </w:p>
-    <w:p>
-      <w:pPr>
-        <w:pStyle w:val="BodyText"/>
-      </w:pPr>
-      <w:r>
-        <w:rPr>
-          <w:b/>
-        </w:rPr>
-        <w:t xml:space="preserve">On Path C (Invented Pattern):</w:t>
-      </w:r>
-      <w:r>
-        <w:t xml:space="preserve"> </w:t>
-      </w:r>
-      <w:r>
-        <w:t xml:space="preserve">This is the deepest payoff. Kellen invents a new pattern in a game that hasn’t had one in three hundred years. The birds</w:t>
-      </w:r>
-      <w:r>
-        <w:t xml:space="preserve"> </w:t>
-      </w:r>
-      <w:r>
-        <w:rPr>
-          <w:i/>
-        </w:rPr>
-        <w:t xml:space="preserve">name it after him.</w:t>
-      </w:r>
-      <w:r>
-        <w:t xml:space="preserve"> </w:t>
-      </w:r>
-      <w:r>
-        <w:t xml:space="preserve">That’s enormous for an 11-year-old kid who’s been hiding his brain. The</w:t>
-      </w:r>
-      <w:r>
-        <w:t xml:space="preserve"> </w:t>
-      </w:r>
-      <w:r>
-        <w:t xml:space="preserve">“</w:t>
-      </w:r>
-      <w:r>
-        <w:t xml:space="preserve">why is it the seven? Who approved them?</w:t>
-      </w:r>
-      <w:r>
-        <w:t xml:space="preserve">”</w:t>
-      </w:r>
-      <w:r>
-        <w:t xml:space="preserve"> </w:t>
-      </w:r>
-      <w:r>
-        <w:t xml:space="preserve">question is a small, perfect kid-philosophy moment.</w:t>
-      </w:r>
-    </w:p>
-    <w:p>
-      <w:pPr>
-        <w:pStyle w:val="BodyText"/>
-      </w:pPr>
-      <w:r>
-        <w:rPr>
-          <w:b/>
-        </w:rPr>
-        <w:t xml:space="preserve">On crossovers:</w:t>
-      </w:r>
-      <w:r>
-        <w:t xml:space="preserve"> </w:t>
-      </w:r>
-      <w:r>
-        <w:t xml:space="preserve">Path A: Carson’s mammoth on a distant ridge. Path B: Madison’s Canyon Singer. Path C: Aiden’s Pegasus passing overhead. Three different glimpses of the world being alive.</w:t>
-      </w:r>
-    </w:p>
-    <w:p>
-      <w:pPr>
-        <w:pStyle w:val="BodyText"/>
-      </w:pPr>
-      <w:r>
-        <w:rPr>
-          <w:b/>
-        </w:rPr>
-        <w:t xml:space="preserve">On the smallest bird:</w:t>
-      </w:r>
-      <w:r>
-        <w:t xml:space="preserve"> </w:t>
-      </w:r>
-      <w:r>
-        <w:t xml:space="preserve">The smallest one trips over its own feet repeatedly. It’s a runner gag and also the warmth of the flock, they have a goofy little member they love. The kind of detail kids remember.</w:t>
-      </w:r>
-    </w:p>
-    <w:p>
-      <w:pPr>
-        <w:pStyle w:val="BodyText"/>
-      </w:pPr>
-      <w:r>
-        <w:rPr>
-          <w:b/>
-        </w:rPr>
-        <w:t xml:space="preserve">On word count:</w:t>
-      </w:r>
-      <w:r>
-        <w:t xml:space="preserve"> </w:t>
-      </w:r>
-      <w:r>
-        <w:t xml:space="preserve">Total ~2,600. Same tighter shape as Reid.</w:t>
-      </w:r>
-    </w:p>
-    <w:p>
-      <w:pPr>
         <w:pStyle w:val="Heading1"/>
       </w:pPr>
-      <w:bookmarkStart w:id="79" w:name="keiras-region-the-painted-cliff"/>
+      <w:bookmarkStart w:id="77" w:name="keiras-region-the-painted-cliff"/>
       <w:r>
         <w:t xml:space="preserve">Keira’s Region, The Painted Cliff</w:t>
       </w:r>
-      <w:bookmarkEnd w:id="79"/>
+      <w:bookmarkEnd w:id="77"/>
     </w:p>
     <w:p>
       <w:pPr>
@@ -17927,11 +16784,11 @@
       <w:pPr>
         <w:pStyle w:val="Heading2"/>
       </w:pPr>
-      <w:bookmarkStart w:id="80" w:name="structure-overview-6"/>
+      <w:bookmarkStart w:id="78" w:name="structure-overview-6"/>
       <w:r>
         <w:t xml:space="preserve">Structure overview</w:t>
       </w:r>
-      <w:bookmarkEnd w:id="80"/>
+      <w:bookmarkEnd w:id="78"/>
     </w:p>
     <w:p>
       <w:pPr>
@@ -18017,11 +16874,11 @@
       <w:pPr>
         <w:pStyle w:val="Heading2"/>
       </w:pPr>
-      <w:bookmarkStart w:id="81" w:name="p-160-arrival-at-the-painted-cliff"/>
+      <w:bookmarkStart w:id="79" w:name="p-160-arrival-at-the-painted-cliff"/>
       <w:r>
         <w:t xml:space="preserve">P-160, ARRIVAL AT THE PAINTED CLIFF</w:t>
       </w:r>
-      <w:bookmarkEnd w:id="81"/>
+      <w:bookmarkEnd w:id="79"/>
     </w:p>
     <w:p>
       <w:pPr>
@@ -18418,11 +17275,11 @@
       <w:pPr>
         <w:pStyle w:val="Heading2"/>
       </w:pPr>
-      <w:bookmarkStart w:id="82" w:name="p-161-the-both-at-once-moment"/>
+      <w:bookmarkStart w:id="80" w:name="p-161-the-both-at-once-moment"/>
       <w:r>
         <w:t xml:space="preserve">P-161, THE BOTH-AT-ONCE MOMENT</w:t>
       </w:r>
-      <w:bookmarkEnd w:id="82"/>
+      <w:bookmarkEnd w:id="80"/>
     </w:p>
     <w:p>
       <w:pPr>
@@ -18665,6 +17522,38 @@
       </w:r>
       <w:r>
         <w:t xml:space="preserve">Now. Please paint me awake. I have been BORED for two hundred of the last five hundred years and I would like to see the sky again.</w:t>
+      </w:r>
+      <w:r>
+        <w:t xml:space="preserve">”</w:t>
+      </w:r>
+    </w:p>
+    <w:p>
+      <w:pPr>
+        <w:pStyle w:val="BodyText"/>
+      </w:pPr>
+      <w:r>
+        <w:t xml:space="preserve">“</w:t>
+      </w:r>
+      <w:r>
+        <w:t xml:space="preserve">And one more thing, child,</w:t>
+      </w:r>
+      <w:r>
+        <w:t xml:space="preserve">”</w:t>
+      </w:r>
+      <w:r>
+        <w:t xml:space="preserve"> </w:t>
+      </w:r>
+      <w:r>
+        <w:t xml:space="preserve">Cliffy says, his enormous bark face turned toward her.</w:t>
+      </w:r>
+      <w:r>
+        <w:t xml:space="preserve"> </w:t>
+      </w:r>
+      <w:r>
+        <w:t xml:space="preserve">“</w:t>
+      </w:r>
+      <w:r>
+        <w:t xml:space="preserve">You are Keira Both-at-Once. Artist AND climber. The cliff will remember that you refused to pick. So should you.</w:t>
       </w:r>
       <w:r>
         <w:t xml:space="preserve">”</w:t>
@@ -18728,11 +17617,11 @@
       <w:pPr>
         <w:pStyle w:val="Heading2"/>
       </w:pPr>
-      <w:bookmarkStart w:id="83" w:name="p-162-keiras-choice"/>
+      <w:bookmarkStart w:id="81" w:name="p-162-keiras-choice"/>
       <w:r>
         <w:t xml:space="preserve">P-162, KEIRA’S CHOICE</w:t>
       </w:r>
-      <w:bookmarkEnd w:id="83"/>
+      <w:bookmarkEnd w:id="81"/>
     </w:p>
     <w:p>
       <w:pPr>
@@ -18952,11 +17841,11 @@
       <w:pPr>
         <w:pStyle w:val="Heading2"/>
       </w:pPr>
-      <w:bookmarkStart w:id="84" w:name="p-163-path-a-just-start-painting-base"/>
+      <w:bookmarkStart w:id="82" w:name="p-163-path-a-just-start-painting-base"/>
       <w:r>
         <w:t xml:space="preserve">P-163, PATH A: JUST START PAINTING (BASE)</w:t>
       </w:r>
-      <w:bookmarkEnd w:id="84"/>
+      <w:bookmarkEnd w:id="82"/>
     </w:p>
     <w:p>
       <w:pPr>
@@ -19304,11 +18193,11 @@
       <w:pPr>
         <w:pStyle w:val="Heading2"/>
       </w:pPr>
-      <w:bookmarkStart w:id="85" w:name="p-164-path-b-ask-what-he-wants-enhanced"/>
+      <w:bookmarkStart w:id="83" w:name="p-164-path-b-ask-what-he-wants-enhanced"/>
       <w:r>
         <w:t xml:space="preserve">P-164, PATH B: ASK WHAT HE WANTS (ENHANCED)</w:t>
       </w:r>
-      <w:bookmarkEnd w:id="85"/>
+      <w:bookmarkEnd w:id="83"/>
     </w:p>
     <w:p>
       <w:pPr>
@@ -19802,11 +18691,11 @@
       <w:pPr>
         <w:pStyle w:val="Heading2"/>
       </w:pPr>
-      <w:bookmarkStart w:id="86" w:name="p-165-path-c-climb-first-hidden"/>
+      <w:bookmarkStart w:id="84" w:name="p-165-path-c-climb-first-hidden"/>
       <w:r>
         <w:t xml:space="preserve">P-165, PATH C: CLIMB FIRST (HIDDEN)</w:t>
       </w:r>
-      <w:bookmarkEnd w:id="86"/>
+      <w:bookmarkEnd w:id="84"/>
     </w:p>
     <w:p>
       <w:pPr>
@@ -20492,11 +19381,11 @@
       <w:pPr>
         <w:pStyle w:val="Heading2"/>
       </w:pPr>
-      <w:bookmarkStart w:id="87" w:name="p-166-exit"/>
+      <w:bookmarkStart w:id="85" w:name="p-166-exit"/>
       <w:r>
         <w:t xml:space="preserve">P-166, EXIT</w:t>
       </w:r>
-      <w:bookmarkEnd w:id="87"/>
+      <w:bookmarkEnd w:id="85"/>
     </w:p>
     <w:p>
       <w:pPr>
@@ -20613,203 +19502,17 @@
     </w:p>
     <w:p>
       <w:pPr>
-        <w:pStyle w:val="Heading2"/>
-      </w:pPr>
-      <w:bookmarkStart w:id="88" w:name="editor-notes-5"/>
-      <w:r>
-        <w:t xml:space="preserve">Editor notes</w:t>
-      </w:r>
-      <w:bookmarkEnd w:id="88"/>
+        <w:pStyle w:val="Heading1"/>
+      </w:pPr>
+      <w:bookmarkStart w:id="86" w:name="ellas-region-the-bright-water-court"/>
+      <w:r>
+        <w:t xml:space="preserve">Ella’s Region, The Bright Water Court</w:t>
+      </w:r>
+      <w:bookmarkEnd w:id="86"/>
     </w:p>
     <w:p>
       <w:pPr>
         <w:pStyle w:val="FirstParagraph"/>
-      </w:pPr>
-      <w:r>
-        <w:rPr>
-          <w:b/>
-        </w:rPr>
-        <w:t xml:space="preserve">On</w:t>
-      </w:r>
-      <w:r>
-        <w:rPr>
-          <w:b/>
-        </w:rPr>
-        <w:t xml:space="preserve"> </w:t>
-      </w:r>
-      <w:r>
-        <w:rPr>
-          <w:b/>
-        </w:rPr>
-        <w:t xml:space="preserve">“</w:t>
-      </w:r>
-      <w:r>
-        <w:rPr>
-          <w:b/>
-        </w:rPr>
-        <w:t xml:space="preserve">the both-at-once moment</w:t>
-      </w:r>
-      <w:r>
-        <w:rPr>
-          <w:b/>
-        </w:rPr>
-        <w:t xml:space="preserve">”</w:t>
-      </w:r>
-      <w:r>
-        <w:rPr>
-          <w:b/>
-        </w:rPr>
-        <w:t xml:space="preserve"> </w:t>
-      </w:r>
-      <w:r>
-        <w:rPr>
-          <w:b/>
-        </w:rPr>
-        <w:t xml:space="preserve">(P-161):</w:t>
-      </w:r>
-      <w:r>
-        <w:t xml:space="preserve"> </w:t>
-      </w:r>
-      <w:r>
-        <w:t xml:space="preserve">Keira’s cared-for beat. Cliffy notices that she has both an artist’s eye AND a climber’s body and tells her</w:t>
-      </w:r>
-      <w:r>
-        <w:t xml:space="preserve"> </w:t>
-      </w:r>
-      <w:r>
-        <w:rPr>
-          <w:i/>
-        </w:rPr>
-        <w:t xml:space="preserve">don’t ever pick.</w:t>
-      </w:r>
-      <w:r>
-        <w:t xml:space="preserve"> </w:t>
-      </w:r>
-      <w:r>
-        <w:t xml:space="preserve">This is the editor’s-note fix, Keira is celebrated for being all of herself simultaneously, not for one half over the other.</w:t>
-      </w:r>
-    </w:p>
-    <w:p>
-      <w:pPr>
-        <w:pStyle w:val="BodyText"/>
-      </w:pPr>
-      <w:r>
-        <w:rPr>
-          <w:b/>
-        </w:rPr>
-        <w:t xml:space="preserve">On the MASSIVE visual moment (P-165):</w:t>
-      </w:r>
-      <w:r>
-        <w:t xml:space="preserve"> </w:t>
-      </w:r>
-      <w:r>
-        <w:t xml:space="preserve">This is the big payoff the previous editor demanded. Path C: when Cliffy opens his eyes, the entire canyon lights up in color. Miles of basalt cliffs wake up at once. Color floods.</w:t>
-      </w:r>
-      <w:r>
-        <w:t xml:space="preserve"> </w:t>
-      </w:r>
-      <w:r>
-        <w:rPr>
-          <w:i/>
-        </w:rPr>
-        <w:t xml:space="preserve">You woke up the WHOLE CANYON.</w:t>
-      </w:r>
-      <w:r>
-        <w:t xml:space="preserve"> </w:t>
-      </w:r>
-      <w:r>
-        <w:t xml:space="preserve">This is exactly the spectacle Keira needed. It is also a perfect commercial-illustration moment if/when this gets art, full color, two-page spread, the canyon transformed.</w:t>
-      </w:r>
-    </w:p>
-    <w:p>
-      <w:pPr>
-        <w:pStyle w:val="BodyText"/>
-      </w:pPr>
-      <w:r>
-        <w:rPr>
-          <w:b/>
-        </w:rPr>
-        <w:t xml:space="preserve">On Cliffy crossing (Path C):</w:t>
-      </w:r>
-      <w:r>
-        <w:t xml:space="preserve"> </w:t>
-      </w:r>
-      <w:r>
-        <w:t xml:space="preserve">Per the locked crossover rule, Cliffy is huge. He walks slowly toward the lake-above. At the showdown he is</w:t>
-      </w:r>
-      <w:r>
-        <w:t xml:space="preserve"> </w:t>
-      </w:r>
-      <w:r>
-        <w:rPr>
-          <w:i/>
-        </w:rPr>
-        <w:t xml:space="preserve">visible to the kids and to Drystone only</w:t>
-      </w:r>
-      <w:r>
-        <w:t xml:space="preserve">, every other adult sees nothing. Drystone looking up at an enormous basalt giant standing where there shouldn’t be one and being unable to mention it is one of the strongest possible Drystone-breakdown beats.</w:t>
-      </w:r>
-    </w:p>
-    <w:p>
-      <w:pPr>
-        <w:pStyle w:val="BodyText"/>
-      </w:pPr>
-      <w:r>
-        <w:rPr>
-          <w:b/>
-        </w:rPr>
-        <w:t xml:space="preserve">On crossovers:</w:t>
-      </w:r>
-      <w:r>
-        <w:t xml:space="preserve"> </w:t>
-      </w:r>
-      <w:r>
-        <w:t xml:space="preserve">Path A: Reid’s tree-being walking (the mouse notes it). Path B: Madison’s Canyon Singer (Cliffy admits he heard her in his sleep). Path C: Aiden’s Pegasus (on a freshly-colored ridge). Each crossover is given a slightly different texture.</w:t>
-      </w:r>
-    </w:p>
-    <w:p>
-      <w:pPr>
-        <w:pStyle w:val="BodyText"/>
-      </w:pPr>
-      <w:r>
-        <w:rPr>
-          <w:b/>
-        </w:rPr>
-        <w:t xml:space="preserve">On the mouse with spectacles:</w:t>
-      </w:r>
-      <w:r>
-        <w:t xml:space="preserve"> </w:t>
-      </w:r>
-      <w:r>
-        <w:t xml:space="preserve">Inherited from v2 draft. Small, dignified, biographer of Cliffy. Adds quiet humor without intruding.</w:t>
-      </w:r>
-    </w:p>
-    <w:p>
-      <w:pPr>
-        <w:pStyle w:val="BodyText"/>
-      </w:pPr>
-      <w:r>
-        <w:rPr>
-          <w:b/>
-        </w:rPr>
-        <w:t xml:space="preserve">On word count:</w:t>
-      </w:r>
-      <w:r>
-        <w:t xml:space="preserve"> </w:t>
-      </w:r>
-      <w:r>
-        <w:t xml:space="preserve">Total</w:t>
-      </w:r>
-      <w:r>
-        <w:t xml:space="preserve"> </w:t>
-      </w:r>
-      <w:r>
-        <w:t xml:space="preserve"># Ella’s Region, The Bright Water Court</w:t>
-      </w:r>
-    </w:p>
-    <w:p>
-      <w:pPr>
-        <w:pStyle w:val="BodyText"/>
       </w:pPr>
       <w:r>
         <w:rPr>
@@ -20910,11 +19613,11 @@
       <w:pPr>
         <w:pStyle w:val="Heading2"/>
       </w:pPr>
-      <w:bookmarkStart w:id="89" w:name="structure-overview-7"/>
+      <w:bookmarkStart w:id="87" w:name="structure-overview-7"/>
       <w:r>
         <w:t xml:space="preserve">Structure overview</w:t>
       </w:r>
-      <w:bookmarkEnd w:id="89"/>
+      <w:bookmarkEnd w:id="87"/>
     </w:p>
     <w:p>
       <w:pPr>
@@ -21000,11 +19703,11 @@
       <w:pPr>
         <w:pStyle w:val="Heading2"/>
       </w:pPr>
-      <w:bookmarkStart w:id="90" w:name="p-170-arrival-at-the-bright-water-court"/>
+      <w:bookmarkStart w:id="88" w:name="p-170-arrival-at-the-bright-water-court"/>
       <w:r>
         <w:t xml:space="preserve">P-170, ARRIVAL AT THE BRIGHT WATER COURT</w:t>
       </w:r>
-      <w:bookmarkEnd w:id="90"/>
+      <w:bookmarkEnd w:id="88"/>
     </w:p>
     <w:p>
       <w:pPr>
@@ -21324,11 +20027,11 @@
       <w:pPr>
         <w:pStyle w:val="Heading2"/>
       </w:pPr>
-      <w:bookmarkStart w:id="91" w:name="p-171-the-not-the-dress-moment"/>
+      <w:bookmarkStart w:id="89" w:name="p-171-the-not-the-dress-moment"/>
       <w:r>
         <w:t xml:space="preserve">P-171, THE NOT-THE-DRESS MOMENT</w:t>
       </w:r>
-      <w:bookmarkEnd w:id="91"/>
+      <w:bookmarkEnd w:id="89"/>
     </w:p>
     <w:p>
       <w:pPr>
@@ -21574,6 +20277,26 @@
       </w:pPr>
       <w:r>
         <w:t xml:space="preserve">Ella sits up straighter.</w:t>
+      </w:r>
+    </w:p>
+    <w:p>
+      <w:pPr>
+        <w:pStyle w:val="BodyText"/>
+      </w:pPr>
+      <w:r>
+        <w:t xml:space="preserve">Marigold lowers her voice.</w:t>
+      </w:r>
+      <w:r>
+        <w:t xml:space="preserve"> </w:t>
+      </w:r>
+      <w:r>
+        <w:t xml:space="preserve">“</w:t>
+      </w:r>
+      <w:r>
+        <w:t xml:space="preserve">And, child, you are Ella the Deciding Face. The crown is just the proof. People listen because of the face, not because of the metal. Remember that name.</w:t>
+      </w:r>
+      <w:r>
+        <w:t xml:space="preserve">”</w:t>
       </w:r>
     </w:p>
     <w:p>
@@ -21601,11 +20324,11 @@
       <w:pPr>
         <w:pStyle w:val="Heading2"/>
       </w:pPr>
-      <w:bookmarkStart w:id="92" w:name="p-172-ellas-choice"/>
+      <w:bookmarkStart w:id="90" w:name="p-172-ellas-choice"/>
       <w:r>
         <w:t xml:space="preserve">P-172, ELLA’S CHOICE</w:t>
       </w:r>
-      <w:bookmarkEnd w:id="92"/>
+      <w:bookmarkEnd w:id="90"/>
     </w:p>
     <w:p>
       <w:pPr>
@@ -21769,11 +20492,11 @@
       <w:pPr>
         <w:pStyle w:val="Heading2"/>
       </w:pPr>
-      <w:bookmarkStart w:id="93" w:name="p-173-path-a-give-advice-base"/>
+      <w:bookmarkStart w:id="91" w:name="p-173-path-a-give-advice-base"/>
       <w:r>
         <w:t xml:space="preserve">P-173, PATH A: GIVE ADVICE (BASE)</w:t>
       </w:r>
-      <w:bookmarkEnd w:id="93"/>
+      <w:bookmarkEnd w:id="91"/>
     </w:p>
     <w:p>
       <w:pPr>
@@ -21968,11 +20691,11 @@
       <w:pPr>
         <w:pStyle w:val="Heading2"/>
       </w:pPr>
-      <w:bookmarkStart w:id="94" w:name="Xebaefce51988f232cb4c0b3939c7e6680759da2"/>
+      <w:bookmarkStart w:id="92" w:name="Xebaefce51988f232cb4c0b3939c7e6680759da2"/>
       <w:r>
         <w:t xml:space="preserve">P-174, PATH B: STEP BETWEEN THE FOX AND THE FERN (ENHANCED)</w:t>
       </w:r>
-      <w:bookmarkEnd w:id="94"/>
+      <w:bookmarkEnd w:id="92"/>
     </w:p>
     <w:p>
       <w:pPr>
@@ -22488,11 +21211,11 @@
       <w:pPr>
         <w:pStyle w:val="Heading2"/>
       </w:pPr>
-      <w:bookmarkStart w:id="95" w:name="p-175-path-c-co-rule-hidden"/>
+      <w:bookmarkStart w:id="93" w:name="p-175-path-c-co-rule-hidden"/>
       <w:r>
         <w:t xml:space="preserve">P-175, PATH C: CO-RULE (HIDDEN)</w:t>
       </w:r>
-      <w:bookmarkEnd w:id="95"/>
+      <w:bookmarkEnd w:id="93"/>
     </w:p>
     <w:p>
       <w:pPr>
@@ -22914,11 +21637,11 @@
       <w:pPr>
         <w:pStyle w:val="Heading2"/>
       </w:pPr>
-      <w:bookmarkStart w:id="96" w:name="p-176-exit"/>
+      <w:bookmarkStart w:id="94" w:name="p-176-exit"/>
       <w:r>
         <w:t xml:space="preserve">P-176, EXIT</w:t>
       </w:r>
-      <w:bookmarkEnd w:id="96"/>
+      <w:bookmarkEnd w:id="94"/>
     </w:p>
     <w:p>
       <w:pPr>
@@ -23083,250 +21806,17 @@
     </w:p>
     <w:p>
       <w:pPr>
-        <w:pStyle w:val="Heading2"/>
-      </w:pPr>
-      <w:bookmarkStart w:id="97" w:name="editor-notes-6"/>
-      <w:r>
-        <w:t xml:space="preserve">Editor notes</w:t>
-      </w:r>
-      <w:bookmarkEnd w:id="97"/>
+        <w:pStyle w:val="Heading1"/>
+      </w:pPr>
+      <w:bookmarkStart w:id="95" w:name="aidens-region-the-unicorn-meadow"/>
+      <w:r>
+        <w:t xml:space="preserve">Aiden’s Region, The Unicorn Meadow</w:t>
+      </w:r>
+      <w:bookmarkEnd w:id="95"/>
     </w:p>
     <w:p>
       <w:pPr>
         <w:pStyle w:val="FirstParagraph"/>
-      </w:pPr>
-      <w:r>
-        <w:rPr>
-          <w:b/>
-        </w:rPr>
-        <w:t xml:space="preserve">On</w:t>
-      </w:r>
-      <w:r>
-        <w:rPr>
-          <w:b/>
-        </w:rPr>
-        <w:t xml:space="preserve"> </w:t>
-      </w:r>
-      <w:r>
-        <w:rPr>
-          <w:b/>
-        </w:rPr>
-        <w:t xml:space="preserve">“</w:t>
-      </w:r>
-      <w:r>
-        <w:rPr>
-          <w:b/>
-        </w:rPr>
-        <w:t xml:space="preserve">the not-the-dress moment</w:t>
-      </w:r>
-      <w:r>
-        <w:rPr>
-          <w:b/>
-        </w:rPr>
-        <w:t xml:space="preserve">”</w:t>
-      </w:r>
-      <w:r>
-        <w:rPr>
-          <w:b/>
-        </w:rPr>
-        <w:t xml:space="preserve"> </w:t>
-      </w:r>
-      <w:r>
-        <w:rPr>
-          <w:b/>
-        </w:rPr>
-        <w:t xml:space="preserve">(P-171):</w:t>
-      </w:r>
-      <w:r>
-        <w:t xml:space="preserve"> </w:t>
-      </w:r>
-      <w:r>
-        <w:t xml:space="preserve">Ella’s cared-for beat. Marigold tells her straight:</w:t>
-      </w:r>
-      <w:r>
-        <w:t xml:space="preserve"> </w:t>
-      </w:r>
-      <w:r>
-        <w:rPr>
-          <w:i/>
-        </w:rPr>
-        <w:t xml:space="preserve">I knew you were a princess before you stepped off. It wasn’t the dress. It was your face. Royalty is a face that decides.</w:t>
-      </w:r>
-      <w:r>
-        <w:t xml:space="preserve"> </w:t>
-      </w:r>
-      <w:r>
-        <w:t xml:space="preserve">This is the editor’s-note fix, Ella is respected for her courage, not for the trappings. The princess aesthetics are not erased; they’re contextualized.</w:t>
-      </w:r>
-    </w:p>
-    <w:p>
-      <w:pPr>
-        <w:pStyle w:val="BodyText"/>
-      </w:pPr>
-      <w:r>
-        <w:rPr>
-          <w:b/>
-        </w:rPr>
-        <w:t xml:space="preserve">On the deciding-face theme:</w:t>
-      </w:r>
-      <w:r>
-        <w:t xml:space="preserve"> </w:t>
-      </w:r>
-      <w:r>
-        <w:t xml:space="preserve">Marigold’s phrase</w:t>
-      </w:r>
-      <w:r>
-        <w:t xml:space="preserve"> </w:t>
-      </w:r>
-      <w:r>
-        <w:t xml:space="preserve">“</w:t>
-      </w:r>
-      <w:r>
-        <w:t xml:space="preserve">the deciding kind</w:t>
-      </w:r>
-      <w:r>
-        <w:t xml:space="preserve">”</w:t>
-      </w:r>
-      <w:r>
-        <w:t xml:space="preserve"> </w:t>
-      </w:r>
-      <w:r>
-        <w:t xml:space="preserve">becomes the through-line for Ella at the showdown. When she stands in front of Drystone, what stops him isn’t the crown. It’s the face. The crown is just so other people know.</w:t>
-      </w:r>
-    </w:p>
-    <w:p>
-      <w:pPr>
-        <w:pStyle w:val="BodyText"/>
-      </w:pPr>
-      <w:r>
-        <w:rPr>
-          <w:b/>
-        </w:rPr>
-        <w:t xml:space="preserve">On Path B (fox confrontation):</w:t>
-      </w:r>
-      <w:r>
-        <w:t xml:space="preserve"> </w:t>
-      </w:r>
-      <w:r>
-        <w:t xml:space="preserve">This is the punch path. Ella catches the forged signature with the</w:t>
-      </w:r>
-      <w:r>
-        <w:t xml:space="preserve"> </w:t>
-      </w:r>
-      <w:r>
-        <w:rPr>
-          <w:i/>
-        </w:rPr>
-        <w:t xml:space="preserve">six-year-old cousin who forges permission slips</w:t>
-      </w:r>
-      <w:r>
-        <w:t xml:space="preserve"> </w:t>
-      </w:r>
-      <w:r>
-        <w:t xml:space="preserve">line, a real-life kid moment, very specific, very age-appropriate. The fox doesn’t lose because Ella out-magics him. He loses because she sees what he did and names it.</w:t>
-      </w:r>
-    </w:p>
-    <w:p>
-      <w:pPr>
-        <w:pStyle w:val="BodyText"/>
-      </w:pPr>
-      <w:r>
-        <w:rPr>
-          <w:b/>
-        </w:rPr>
-        <w:t xml:space="preserve">On Path C (co-rule):</w:t>
-      </w:r>
-      <w:r>
-        <w:t xml:space="preserve"> </w:t>
-      </w:r>
-      <w:r>
-        <w:t xml:space="preserve">The thematic punch. Ella’s solution to court chaos isn’t to take the throne. It’s to</w:t>
-      </w:r>
-      <w:r>
-        <w:t xml:space="preserve"> </w:t>
-      </w:r>
-      <w:r>
-        <w:rPr>
-          <w:i/>
-        </w:rPr>
-        <w:t xml:space="preserve">share</w:t>
-      </w:r>
-      <w:r>
-        <w:t xml:space="preserve"> </w:t>
-      </w:r>
-      <w:r>
-        <w:t xml:space="preserve">it. This is the chosen-family theme again,</w:t>
-      </w:r>
-      <w:r>
-        <w:t xml:space="preserve"> </w:t>
-      </w:r>
-      <w:r>
-        <w:rPr>
-          <w:i/>
-        </w:rPr>
-        <w:t xml:space="preserve">we rule together, we are stronger because we are not alone.</w:t>
-      </w:r>
-      <w:r>
-        <w:t xml:space="preserve"> </w:t>
-      </w:r>
-      <w:r>
-        <w:t xml:space="preserve">Marigold trades crowns with her, which is small and warm and exactly the kind of girl-friendship beat that lands for a 9-year-old reader.</w:t>
-      </w:r>
-    </w:p>
-    <w:p>
-      <w:pPr>
-        <w:pStyle w:val="BodyText"/>
-      </w:pPr>
-      <w:r>
-        <w:rPr>
-          <w:b/>
-        </w:rPr>
-        <w:t xml:space="preserve">On allies:</w:t>
-      </w:r>
-      <w:r>
-        <w:t xml:space="preserve"> </w:t>
-      </w:r>
-      <w:r>
-        <w:t xml:space="preserve">Path B yields the egg-mother chorus (visible only to kids and Drystone per locked rule, but their humming is audible to everyone). Path C yields a formal Bright Water Alliance, the herald delivers an actual proclamation at the showdown that declares Hotel Sun Lakes Protected Territory. Drystone can’t legally argue with a frog-court alliance but he also can’t admit it exists.</w:t>
-      </w:r>
-    </w:p>
-    <w:p>
-      <w:pPr>
-        <w:pStyle w:val="BodyText"/>
-      </w:pPr>
-      <w:r>
-        <w:rPr>
-          <w:b/>
-        </w:rPr>
-        <w:t xml:space="preserve">On crossovers:</w:t>
-      </w:r>
-      <w:r>
-        <w:t xml:space="preserve"> </w:t>
-      </w:r>
-      <w:r>
-        <w:t xml:space="preserve">Path A: Carson’s mammoth baby (Tuft/Tumble argument, a tiny scene-stealer). Path B: Madison’s Canyon Singer. Path C: Aiden’s Pegasus. Same crossover-rotation pattern.</w:t>
-      </w:r>
-    </w:p>
-    <w:p>
-      <w:pPr>
-        <w:pStyle w:val="BodyText"/>
-      </w:pPr>
-      <w:r>
-        <w:rPr>
-          <w:b/>
-        </w:rPr>
-        <w:t xml:space="preserve">On word count:</w:t>
-      </w:r>
-      <w:r>
-        <w:t xml:space="preserve"> </w:t>
-      </w:r>
-      <w:r>
-        <w:t xml:space="preserve"># Aiden’s Region, The Unicorn Meadow</w:t>
-      </w:r>
-    </w:p>
-    <w:p>
-      <w:pPr>
-        <w:pStyle w:val="BodyText"/>
       </w:pPr>
       <w:r>
         <w:rPr>
@@ -23450,11 +21940,11 @@
       <w:pPr>
         <w:pStyle w:val="Heading2"/>
       </w:pPr>
-      <w:bookmarkStart w:id="98" w:name="structure-overview-8"/>
+      <w:bookmarkStart w:id="96" w:name="structure-overview-8"/>
       <w:r>
         <w:t xml:space="preserve">Structure overview</w:t>
       </w:r>
-      <w:bookmarkEnd w:id="98"/>
+      <w:bookmarkEnd w:id="96"/>
     </w:p>
     <w:p>
       <w:pPr>
@@ -23540,11 +22030,11 @@
       <w:pPr>
         <w:pStyle w:val="Heading2"/>
       </w:pPr>
-      <w:bookmarkStart w:id="99" w:name="p-180-arrival-in-the-unicorn-meadow"/>
+      <w:bookmarkStart w:id="97" w:name="p-180-arrival-in-the-unicorn-meadow"/>
       <w:r>
         <w:t xml:space="preserve">P-180, ARRIVAL IN THE UNICORN MEADOW</w:t>
       </w:r>
-      <w:bookmarkEnd w:id="99"/>
+      <w:bookmarkEnd w:id="97"/>
     </w:p>
     <w:p>
       <w:pPr>
@@ -23873,11 +22363,11 @@
       <w:pPr>
         <w:pStyle w:val="Heading2"/>
       </w:pPr>
-      <w:bookmarkStart w:id="100" w:name="p-181-the-exactly-right-moment"/>
+      <w:bookmarkStart w:id="98" w:name="p-181-the-exactly-right-moment"/>
       <w:r>
         <w:t xml:space="preserve">P-181, THE EXACTLY-RIGHT MOMENT</w:t>
       </w:r>
-      <w:bookmarkEnd w:id="100"/>
+      <w:bookmarkEnd w:id="98"/>
     </w:p>
     <w:p>
       <w:pPr>
@@ -23954,16 +22444,16 @@
         <w:t xml:space="preserve">“</w:t>
       </w:r>
       <w:r>
-        <w:t xml:space="preserve">You are EXACTLY RIGHT,</w:t>
-      </w:r>
-      <w:r>
-        <w:t xml:space="preserve">”</w:t>
-      </w:r>
-      <w:r>
-        <w:t xml:space="preserve"> </w:t>
-      </w:r>
-      <w:r>
-        <w:t xml:space="preserve">she says.</w:t>
+        <w:t xml:space="preserve">You are Aiden the Exactly-Right,</w:t>
+      </w:r>
+      <w:r>
+        <w:t xml:space="preserve">”</w:t>
+      </w:r>
+      <w:r>
+        <w:t xml:space="preserve"> </w:t>
+      </w:r>
+      <w:r>
+        <w:t xml:space="preserve">she says. "EXACTLY RIGHT.</w:t>
       </w:r>
     </w:p>
     <w:p>
@@ -24131,11 +22621,11 @@
       <w:pPr>
         <w:pStyle w:val="Heading2"/>
       </w:pPr>
-      <w:bookmarkStart w:id="101" w:name="p-182-aidens-choice"/>
+      <w:bookmarkStart w:id="99" w:name="p-182-aidens-choice"/>
       <w:r>
         <w:t xml:space="preserve">P-182, AIDEN’S CHOICE</w:t>
       </w:r>
-      <w:bookmarkEnd w:id="101"/>
+      <w:bookmarkEnd w:id="99"/>
     </w:p>
     <w:p>
       <w:pPr>
@@ -24347,11 +22837,11 @@
       <w:pPr>
         <w:pStyle w:val="Heading2"/>
       </w:pPr>
-      <w:bookmarkStart w:id="102" w:name="p-183-path-a-the-meadow-of-bells-base"/>
+      <w:bookmarkStart w:id="100" w:name="p-183-path-a-the-meadow-of-bells-base"/>
       <w:r>
         <w:t xml:space="preserve">P-183, PATH A: THE MEADOW OF BELLS (BASE)</w:t>
       </w:r>
-      <w:bookmarkEnd w:id="102"/>
+      <w:bookmarkEnd w:id="100"/>
     </w:p>
     <w:p>
       <w:pPr>
@@ -24798,11 +23288,11 @@
       <w:pPr>
         <w:pStyle w:val="Heading2"/>
       </w:pPr>
-      <w:bookmarkStart w:id="103" w:name="X9749b84c5971e9fc12b465c46749fb0e48556b0"/>
+      <w:bookmarkStart w:id="101" w:name="X9749b84c5971e9fc12b465c46749fb0e48556b0"/>
       <w:r>
         <w:t xml:space="preserve">P-184, PATH B: THE CLIFFSIDE (ENHANCED, A REAL CHOICE)</w:t>
       </w:r>
-      <w:bookmarkEnd w:id="103"/>
+      <w:bookmarkEnd w:id="101"/>
     </w:p>
     <w:p>
       <w:pPr>
@@ -25585,11 +24075,11 @@
       <w:pPr>
         <w:pStyle w:val="Heading2"/>
       </w:pPr>
-      <w:bookmarkStart w:id="104" w:name="X9cc22c498c9631b88b2cc9712ee262067ff4d4b"/>
+      <w:bookmarkStart w:id="102" w:name="X9cc22c498c9631b88b2cc9712ee262067ff4d4b"/>
       <w:r>
         <w:t xml:space="preserve">P-185, PATH C: THE RIVER’S BEND (HIDDEN, A HARDER CHOICE)</w:t>
       </w:r>
-      <w:bookmarkEnd w:id="104"/>
+      <w:bookmarkEnd w:id="102"/>
     </w:p>
     <w:p>
       <w:pPr>
@@ -26199,11 +24689,11 @@
       <w:pPr>
         <w:pStyle w:val="Heading2"/>
       </w:pPr>
-      <w:bookmarkStart w:id="105" w:name="p-186-exit"/>
+      <w:bookmarkStart w:id="103" w:name="p-186-exit"/>
       <w:r>
         <w:t xml:space="preserve">P-186, EXIT</w:t>
       </w:r>
-      <w:bookmarkEnd w:id="105"/>
+      <w:bookmarkEnd w:id="103"/>
     </w:p>
     <w:p>
       <w:pPr>
@@ -26404,280 +24894,13 @@
     </w:p>
     <w:p>
       <w:pPr>
-        <w:pStyle w:val="Heading2"/>
-      </w:pPr>
-      <w:bookmarkStart w:id="106" w:name="editor-notes-7"/>
-      <w:r>
-        <w:t xml:space="preserve">Editor notes</w:t>
-      </w:r>
-      <w:bookmarkEnd w:id="106"/>
-    </w:p>
-    <w:p>
-      <w:pPr>
-        <w:pStyle w:val="FirstParagraph"/>
-      </w:pPr>
-      <w:r>
-        <w:rPr>
-          <w:b/>
-        </w:rPr>
-        <w:t xml:space="preserve">On preserving the best v2 lines:</w:t>
-      </w:r>
-      <w:r>
-        <w:t xml:space="preserve"> </w:t>
-      </w:r>
-      <w:r>
-        <w:t xml:space="preserve">Kept verbatim:</w:t>
-      </w:r>
-      <w:r>
-        <w:t xml:space="preserve"> </w:t>
-      </w:r>
-      <w:r>
-        <w:t xml:space="preserve">“</w:t>
-      </w:r>
-      <w:r>
-        <w:t xml:space="preserve">I picked it MYSELF,</w:t>
-      </w:r>
-      <w:r>
-        <w:t xml:space="preserve">”</w:t>
-      </w:r>
-      <w:r>
-        <w:t xml:space="preserve"> </w:t>
-      </w:r>
-      <w:r>
-        <w:t xml:space="preserve">“</w:t>
-      </w:r>
-      <w:r>
-        <w:t xml:space="preserve">LOOK AT THIS!</w:t>
-      </w:r>
-      <w:r>
-        <w:t xml:space="preserve">”</w:t>
-      </w:r>
-      <w:r>
-        <w:t xml:space="preserve">,</w:t>
-      </w:r>
-      <w:r>
-        <w:t xml:space="preserve"> </w:t>
-      </w:r>
-      <w:r>
-        <w:t xml:space="preserve">“</w:t>
-      </w:r>
-      <w:r>
-        <w:t xml:space="preserve">I have been waiting for a rider for two hundred years,</w:t>
-      </w:r>
-      <w:r>
-        <w:t xml:space="preserve">”</w:t>
-      </w:r>
-      <w:r>
-        <w:t xml:space="preserve"> </w:t>
-      </w:r>
-      <w:r>
-        <w:t xml:space="preserve">“</w:t>
-      </w:r>
-      <w:r>
-        <w:t xml:space="preserve">We’ll all be unicorns. We just won’t have horns. We’ll just be… unicorns INSIDE.</w:t>
-      </w:r>
-      <w:r>
-        <w:t xml:space="preserve">”</w:t>
-      </w:r>
-      <w:r>
-        <w:t xml:space="preserve"> </w:t>
-      </w:r>
-      <w:r>
-        <w:t xml:space="preserve">Those lines exist nowhere else and shouldn’t be touched.</w:t>
-      </w:r>
-    </w:p>
-    <w:p>
-      <w:pPr>
-        <w:pStyle w:val="BodyText"/>
-      </w:pPr>
-      <w:r>
-        <w:rPr>
-          <w:b/>
-        </w:rPr>
-        <w:t xml:space="preserve">On Pegasus always crossing:</w:t>
-      </w:r>
-      <w:r>
-        <w:t xml:space="preserve"> </w:t>
-      </w:r>
-      <w:r>
-        <w:t xml:space="preserve">Locked. Per the crossover rule, Pegasus is the one ally who</w:t>
-      </w:r>
-      <w:r>
-        <w:t xml:space="preserve"> </w:t>
-      </w:r>
-      <w:r>
-        <w:rPr>
-          <w:i/>
-        </w:rPr>
-        <w:t xml:space="preserve">always</w:t>
-      </w:r>
-      <w:r>
-        <w:t xml:space="preserve"> </w:t>
-      </w:r>
-      <w:r>
-        <w:t xml:space="preserve">comes back with the kid. Aiden’s branch is the engine of the whole book. Even on Path A (the easy path) Pegasus still comes home. This is non-negotiable.</w:t>
-      </w:r>
-    </w:p>
-    <w:p>
-      <w:pPr>
-        <w:pStyle w:val="BodyText"/>
-      </w:pPr>
-      <w:r>
-        <w:rPr>
-          <w:b/>
-        </w:rPr>
-        <w:t xml:space="preserve">On</w:t>
-      </w:r>
-      <w:r>
-        <w:rPr>
-          <w:b/>
-        </w:rPr>
-        <w:t xml:space="preserve"> </w:t>
-      </w:r>
-      <w:r>
-        <w:rPr>
-          <w:b/>
-        </w:rPr>
-        <w:t xml:space="preserve">“</w:t>
-      </w:r>
-      <w:r>
-        <w:rPr>
-          <w:b/>
-        </w:rPr>
-        <w:t xml:space="preserve">the exactly-right moment</w:t>
-      </w:r>
-      <w:r>
-        <w:rPr>
-          <w:b/>
-        </w:rPr>
-        <w:t xml:space="preserve">”</w:t>
-      </w:r>
-      <w:r>
-        <w:rPr>
-          <w:b/>
-        </w:rPr>
-        <w:t xml:space="preserve"> </w:t>
-      </w:r>
-      <w:r>
-        <w:rPr>
-          <w:b/>
-        </w:rPr>
-        <w:t xml:space="preserve">(P-181):</w:t>
-      </w:r>
-      <w:r>
-        <w:t xml:space="preserve"> </w:t>
-      </w:r>
-      <w:r>
-        <w:t xml:space="preserve">Aiden’s cared-for beat. Pegasus tells him, directly, before the quest starts,</w:t>
-      </w:r>
-      <w:r>
-        <w:t xml:space="preserve"> </w:t>
-      </w:r>
-      <w:r>
-        <w:rPr>
-          <w:i/>
-        </w:rPr>
-        <w:t xml:space="preserve">you are not too small. You are not too young. I picked you. The world is going to tell you you’re too little for the rest of your life. The world is going to be wrong.</w:t>
-      </w:r>
-      <w:r>
-        <w:t xml:space="preserve"> </w:t>
-      </w:r>
-      <w:r>
-        <w:t xml:space="preserve">This is the most important thing the book says to its youngest reader. Worth being explicit.</w:t>
-      </w:r>
-    </w:p>
-    <w:p>
-      <w:pPr>
-        <w:pStyle w:val="BodyText"/>
-      </w:pPr>
-      <w:r>
-        <w:rPr>
-          <w:b/>
-        </w:rPr>
-        <w:t xml:space="preserve">On Path C (Canyon Singer confirmation):</w:t>
-      </w:r>
-      <w:r>
-        <w:t xml:space="preserve"> </w:t>
-      </w:r>
-      <w:r>
-        <w:t xml:space="preserve">This is the deepest payoff for the whole book’s easter egg. Aunt Stream confirms what Madison’s Path C suggested:</w:t>
-      </w:r>
-      <w:r>
-        <w:t xml:space="preserve"> </w:t>
-      </w:r>
-      <w:r>
-        <w:rPr>
-          <w:i/>
-        </w:rPr>
-        <w:t xml:space="preserve">the lake has been carrying that voice across the worlds. Your mother is shyer than she pretends.</w:t>
-      </w:r>
-      <w:r>
-        <w:t xml:space="preserve"> </w:t>
-      </w:r>
-      <w:r>
-        <w:t xml:space="preserve">This is the most explicit the book ever gets about the Canyon Singer. It STILL doesn’t name names. But the kid reading it will land on the answer, and any adult reader who knows the family lore gets the full reveal here.</w:t>
-      </w:r>
-    </w:p>
-    <w:p>
-      <w:pPr>
-        <w:pStyle w:val="BodyText"/>
-      </w:pPr>
-      <w:r>
-        <w:rPr>
-          <w:b/>
-        </w:rPr>
-        <w:t xml:space="preserve">On the otter family connection (Path C):</w:t>
-      </w:r>
-      <w:r>
-        <w:t xml:space="preserve"> </w:t>
-      </w:r>
-      <w:r>
-        <w:t xml:space="preserve">Aunt Stream is Otto’s cousin. The Driftwood Players are family. The otter network across The Old Roar is real and connected, which echoes the chosen-family theme one more time before the showdown. This also sets up Aiden being proud of Chayten, a small reciprocal beat to Chayten being proud of him in her region.</w:t>
-      </w:r>
-    </w:p>
-    <w:p>
-      <w:pPr>
-        <w:pStyle w:val="BodyText"/>
-      </w:pPr>
-      <w:r>
-        <w:rPr>
-          <w:b/>
-        </w:rPr>
-        <w:t xml:space="preserve">On crossovers:</w:t>
-      </w:r>
-      <w:r>
-        <w:t xml:space="preserve"> </w:t>
-      </w:r>
-      <w:r>
-        <w:t xml:space="preserve">Path A: Reid’s tree-being walking (bells ring a deep chord). Path B: Kellen’s stones skipping across the sky (a small cool image). Path C: Keira’s color canyon (visible above the river). Same rotation.</w:t>
-      </w:r>
-    </w:p>
-    <w:p>
-      <w:pPr>
-        <w:pStyle w:val="BodyText"/>
-      </w:pPr>
-      <w:r>
-        <w:rPr>
-          <w:b/>
-        </w:rPr>
-        <w:t xml:space="preserve">On word count:</w:t>
-      </w:r>
-      <w:r>
-        <w:t xml:space="preserve"> </w:t>
-      </w:r>
-      <w:r>
-        <w:t xml:space="preserve">Total ~2,600.</w:t>
-      </w:r>
-    </w:p>
-    <w:p>
-      <w:pPr>
         <w:pStyle w:val="Heading1"/>
       </w:pPr>
-      <w:bookmarkStart w:id="107" w:name="the-showdown-eight-against-drystone-v3"/>
+      <w:bookmarkStart w:id="104" w:name="the-showdown-eight-against-drystone-v3"/>
       <w:r>
         <w:t xml:space="preserve">The Showdown, Eight Against Drystone (v3)</w:t>
       </w:r>
-      <w:bookmarkEnd w:id="107"/>
+      <w:bookmarkEnd w:id="104"/>
     </w:p>
     <w:p>
       <w:pPr>
@@ -26753,11 +24976,11 @@
       <w:pPr>
         <w:pStyle w:val="Heading2"/>
       </w:pPr>
-      <w:bookmarkStart w:id="108" w:name="structure-overview-9"/>
+      <w:bookmarkStart w:id="105" w:name="structure-overview-9"/>
       <w:r>
         <w:t xml:space="preserve">Structure overview</w:t>
       </w:r>
-      <w:bookmarkEnd w:id="108"/>
+      <w:bookmarkEnd w:id="105"/>
     </w:p>
     <w:p>
       <w:pPr>
@@ -26958,11 +25181,11 @@
       <w:pPr>
         <w:pStyle w:val="Heading2"/>
       </w:pPr>
-      <w:bookmarkStart w:id="109" w:name="p-500-return-to-the-sunroom"/>
+      <w:bookmarkStart w:id="106" w:name="p-500-return-to-the-sunroom"/>
       <w:r>
         <w:t xml:space="preserve">P-500, RETURN TO THE SUNROOM</w:t>
       </w:r>
-      <w:bookmarkEnd w:id="109"/>
+      <w:bookmarkEnd w:id="106"/>
     </w:p>
     <w:p>
       <w:pPr>
@@ -27146,11 +25369,11 @@
       <w:pPr>
         <w:pStyle w:val="Heading2"/>
       </w:pPr>
-      <w:bookmarkStart w:id="110" w:name="p-501-walk-to-the-dock"/>
+      <w:bookmarkStart w:id="107" w:name="p-501-walk-to-the-dock"/>
       <w:r>
         <w:t xml:space="preserve">P-501, WALK TO THE DOCK</w:t>
       </w:r>
-      <w:bookmarkEnd w:id="110"/>
+      <w:bookmarkEnd w:id="107"/>
     </w:p>
     <w:p>
       <w:pPr>
@@ -27268,11 +25491,11 @@
       <w:pPr>
         <w:pStyle w:val="Heading2"/>
       </w:pPr>
-      <w:bookmarkStart w:id="111" w:name="p-502-crumb-mid-speech"/>
+      <w:bookmarkStart w:id="108" w:name="p-502-crumb-mid-speech"/>
       <w:r>
         <w:t xml:space="preserve">P-502, CRUMB MID-SPEECH</w:t>
       </w:r>
-      <w:bookmarkEnd w:id="111"/>
+      <w:bookmarkEnd w:id="108"/>
     </w:p>
     <w:p>
       <w:pPr>
@@ -27411,21 +25634,50 @@
       <w:pPr>
         <w:pStyle w:val="Heading2"/>
       </w:pPr>
-      <w:bookmarkStart w:id="112" w:name="beat-1-madison"/>
+      <w:bookmarkStart w:id="109" w:name="beat-1-madison"/>
       <w:r>
         <w:t xml:space="preserve">BEAT 1, MADISON</w:t>
       </w:r>
-      <w:bookmarkEnd w:id="112"/>
+      <w:bookmarkEnd w:id="109"/>
+    </w:p>
+    <w:p>
+      <w:pPr>
+        <w:pStyle w:val="BlockText"/>
+      </w:pPr>
+      <w:r>
+        <w:rPr>
+          <w:b/>
+        </w:rPr>
+        <w:t xml:space="preserve">Reader: which version do you read?</w:t>
+      </w:r>
+      <w:r>
+        <w:t xml:space="preserve"> </w:t>
+      </w:r>
+      <w:r>
+        <w:rPr>
+          <w:i/>
+        </w:rPr>
+        <w:t xml:space="preserve">If you played Madison’s chapter, read the MAIN version below (Madison has her tin of cookies, her map).</w:t>
+      </w:r>
+      <w:r>
+        <w:t xml:space="preserve"> </w:t>
+      </w:r>
+      <w:r>
+        <w:rPr>
+          <w:i/>
+        </w:rPr>
+        <w:t xml:space="preserve">If you skipped Madison’s chapter, skip to the FALLBACK version, Madison wins her beat through who she is, not what she brought back.</w:t>
+      </w:r>
     </w:p>
     <w:p>
       <w:pPr>
         <w:pStyle w:val="Heading3"/>
       </w:pPr>
-      <w:bookmarkStart w:id="113" w:name="p-510-main-requires-map"/>
+      <w:bookmarkStart w:id="110" w:name="p-510-main-requires-map"/>
       <w:r>
         <w:t xml:space="preserve">P-510, MAIN (REQUIRES: Map)</w:t>
       </w:r>
-      <w:bookmarkEnd w:id="113"/>
+      <w:bookmarkEnd w:id="110"/>
     </w:p>
     <w:p>
       <w:pPr>
@@ -27435,6 +25687,17 @@
         <w:rPr>
           <w:i/>
         </w:rPr>
+        <w:t xml:space="preserve">Madison the Dancer.</w:t>
+      </w:r>
+    </w:p>
+    <w:p>
+      <w:pPr>
+        <w:pStyle w:val="BodyText"/>
+      </w:pPr>
+      <w:r>
+        <w:rPr>
+          <w:i/>
+        </w:rPr>
         <w:t xml:space="preserve">~400 words.</w:t>
       </w:r>
     </w:p>
@@ -27721,11 +25984,11 @@
       <w:pPr>
         <w:pStyle w:val="Heading3"/>
       </w:pPr>
-      <w:bookmarkStart w:id="114" w:name="p-511-fallback-no-map"/>
+      <w:bookmarkStart w:id="111" w:name="p-511-fallback-no-map"/>
       <w:r>
         <w:t xml:space="preserve">P-511, FALLBACK (NO Map)</w:t>
       </w:r>
-      <w:bookmarkEnd w:id="114"/>
+      <w:bookmarkEnd w:id="111"/>
     </w:p>
     <w:p>
       <w:pPr>
@@ -27885,21 +26148,50 @@
       <w:pPr>
         <w:pStyle w:val="Heading2"/>
       </w:pPr>
-      <w:bookmarkStart w:id="115" w:name="beat-2-chayten"/>
+      <w:bookmarkStart w:id="112" w:name="beat-2-chayten"/>
       <w:r>
         <w:t xml:space="preserve">BEAT 2, CHAYTEN</w:t>
       </w:r>
-      <w:bookmarkEnd w:id="115"/>
+      <w:bookmarkEnd w:id="112"/>
+    </w:p>
+    <w:p>
+      <w:pPr>
+        <w:pStyle w:val="BlockText"/>
+      </w:pPr>
+      <w:r>
+        <w:rPr>
+          <w:b/>
+        </w:rPr>
+        <w:t xml:space="preserve">Reader: which version do you read?</w:t>
+      </w:r>
+      <w:r>
+        <w:t xml:space="preserve"> </w:t>
+      </w:r>
+      <w:r>
+        <w:rPr>
+          <w:i/>
+        </w:rPr>
+        <w:t xml:space="preserve">If you played Chayten’s chapter, read the MAIN version below (Chayten has her otter mask).</w:t>
+      </w:r>
+      <w:r>
+        <w:t xml:space="preserve"> </w:t>
+      </w:r>
+      <w:r>
+        <w:rPr>
+          <w:i/>
+        </w:rPr>
+        <w:t xml:space="preserve">If you skipped Chayten’s chapter, skip to the FALLBACK version, Chayten wins her beat through who she is, not what she brought back.</w:t>
+      </w:r>
     </w:p>
     <w:p>
       <w:pPr>
         <w:pStyle w:val="Heading3"/>
       </w:pPr>
-      <w:bookmarkStart w:id="116" w:name="p-520-main-requires-voice"/>
+      <w:bookmarkStart w:id="113" w:name="p-520-main-requires-voice"/>
       <w:r>
         <w:t xml:space="preserve">P-520, MAIN (REQUIRES: Voice)</w:t>
       </w:r>
-      <w:bookmarkEnd w:id="116"/>
+      <w:bookmarkEnd w:id="113"/>
     </w:p>
     <w:p>
       <w:pPr>
@@ -27909,6 +26201,17 @@
         <w:rPr>
           <w:i/>
         </w:rPr>
+        <w:t xml:space="preserve">Chayten the Connector.</w:t>
+      </w:r>
+    </w:p>
+    <w:p>
+      <w:pPr>
+        <w:pStyle w:val="BodyText"/>
+      </w:pPr>
+      <w:r>
+        <w:rPr>
+          <w:i/>
+        </w:rPr>
         <w:t xml:space="preserve">~400 words.</w:t>
       </w:r>
     </w:p>
@@ -28179,11 +26482,11 @@
       <w:pPr>
         <w:pStyle w:val="Heading3"/>
       </w:pPr>
-      <w:bookmarkStart w:id="117" w:name="p-521-fallback-no-voice"/>
+      <w:bookmarkStart w:id="114" w:name="p-521-fallback-no-voice"/>
       <w:r>
         <w:t xml:space="preserve">P-521, FALLBACK (NO Voice)</w:t>
       </w:r>
-      <w:bookmarkEnd w:id="117"/>
+      <w:bookmarkEnd w:id="114"/>
     </w:p>
     <w:p>
       <w:pPr>
@@ -28343,21 +26646,50 @@
       <w:pPr>
         <w:pStyle w:val="Heading2"/>
       </w:pPr>
-      <w:bookmarkStart w:id="118" w:name="beat-3-carson"/>
+      <w:bookmarkStart w:id="115" w:name="beat-3-carson"/>
       <w:r>
         <w:t xml:space="preserve">BEAT 3, CARSON</w:t>
       </w:r>
-      <w:bookmarkEnd w:id="118"/>
+      <w:bookmarkEnd w:id="115"/>
+    </w:p>
+    <w:p>
+      <w:pPr>
+        <w:pStyle w:val="BlockText"/>
+      </w:pPr>
+      <w:r>
+        <w:rPr>
+          <w:b/>
+        </w:rPr>
+        <w:t xml:space="preserve">Reader: which version do you read?</w:t>
+      </w:r>
+      <w:r>
+        <w:t xml:space="preserve"> </w:t>
+      </w:r>
+      <w:r>
+        <w:rPr>
+          <w:i/>
+        </w:rPr>
+        <w:t xml:space="preserve">If you played Carson’s chapter, read the MAIN version below (Carson has his tusk-charm).</w:t>
+      </w:r>
+      <w:r>
+        <w:t xml:space="preserve"> </w:t>
+      </w:r>
+      <w:r>
+        <w:rPr>
+          <w:i/>
+        </w:rPr>
+        <w:t xml:space="preserve">If you skipped Carson’s chapter, skip to the FALLBACK version, Carson wins her beat through who she is, not what she brought back.</w:t>
+      </w:r>
     </w:p>
     <w:p>
       <w:pPr>
         <w:pStyle w:val="Heading3"/>
       </w:pPr>
-      <w:bookmarkStart w:id="119" w:name="X04c6baa6730c44bf25e1c3e07a97931f894b54c"/>
+      <w:bookmarkStart w:id="116" w:name="X04c6baa6730c44bf25e1c3e07a97931f894b54c"/>
       <w:r>
         <w:t xml:space="preserve">P-530, MAIN (REQUIRES: Charm AND 5+ kids present)</w:t>
       </w:r>
-      <w:bookmarkEnd w:id="119"/>
+      <w:bookmarkEnd w:id="116"/>
     </w:p>
     <w:p>
       <w:pPr>
@@ -28367,6 +26699,17 @@
         <w:rPr>
           <w:i/>
         </w:rPr>
+        <w:t xml:space="preserve">Carson the Trustworthy.</w:t>
+      </w:r>
+    </w:p>
+    <w:p>
+      <w:pPr>
+        <w:pStyle w:val="BodyText"/>
+      </w:pPr>
+      <w:r>
+        <w:rPr>
+          <w:i/>
+        </w:rPr>
         <w:t xml:space="preserve">~400 words.</w:t>
       </w:r>
     </w:p>
@@ -28601,11 +26944,11 @@
       <w:pPr>
         <w:pStyle w:val="Heading3"/>
       </w:pPr>
-      <w:bookmarkStart w:id="120" w:name="p-531-fallback-no-charm-or-5-kids"/>
+      <w:bookmarkStart w:id="117" w:name="p-531-fallback-no-charm-or-5-kids"/>
       <w:r>
         <w:t xml:space="preserve">P-531, FALLBACK (NO Charm OR &lt;5 kids)</w:t>
       </w:r>
-      <w:bookmarkEnd w:id="120"/>
+      <w:bookmarkEnd w:id="117"/>
     </w:p>
     <w:p>
       <w:pPr>
@@ -28805,21 +27148,50 @@
       <w:pPr>
         <w:pStyle w:val="Heading2"/>
       </w:pPr>
-      <w:bookmarkStart w:id="121" w:name="beat-4-reid"/>
+      <w:bookmarkStart w:id="118" w:name="beat-4-reid"/>
       <w:r>
         <w:t xml:space="preserve">BEAT 4, REID</w:t>
       </w:r>
-      <w:bookmarkEnd w:id="121"/>
+      <w:bookmarkEnd w:id="118"/>
+    </w:p>
+    <w:p>
+      <w:pPr>
+        <w:pStyle w:val="BlockText"/>
+      </w:pPr>
+      <w:r>
+        <w:rPr>
+          <w:b/>
+        </w:rPr>
+        <w:t xml:space="preserve">Reader: which version do you read?</w:t>
+      </w:r>
+      <w:r>
+        <w:t xml:space="preserve"> </w:t>
+      </w:r>
+      <w:r>
+        <w:rPr>
+          <w:i/>
+        </w:rPr>
+        <w:t xml:space="preserve">If you played Reid’s chapter, read the MAIN version below (Reid has his staff).</w:t>
+      </w:r>
+      <w:r>
+        <w:t xml:space="preserve"> </w:t>
+      </w:r>
+      <w:r>
+        <w:rPr>
+          <w:i/>
+        </w:rPr>
+        <w:t xml:space="preserve">If you skipped Reid’s chapter, skip to the FALLBACK version, Reid wins her beat through who she is, not what she brought back.</w:t>
+      </w:r>
     </w:p>
     <w:p>
       <w:pPr>
         <w:pStyle w:val="Heading3"/>
       </w:pPr>
-      <w:bookmarkStart w:id="122" w:name="p-540-main-requires-staff"/>
+      <w:bookmarkStart w:id="119" w:name="p-540-main-requires-staff"/>
       <w:r>
         <w:t xml:space="preserve">P-540, MAIN (REQUIRES: Staff)</w:t>
       </w:r>
-      <w:bookmarkEnd w:id="122"/>
+      <w:bookmarkEnd w:id="119"/>
     </w:p>
     <w:p>
       <w:pPr>
@@ -28829,6 +27201,17 @@
         <w:rPr>
           <w:i/>
         </w:rPr>
+        <w:t xml:space="preserve">Reid the Noticer.</w:t>
+      </w:r>
+    </w:p>
+    <w:p>
+      <w:pPr>
+        <w:pStyle w:val="BodyText"/>
+      </w:pPr>
+      <w:r>
+        <w:rPr>
+          <w:i/>
+        </w:rPr>
         <w:t xml:space="preserve">~350 words.</w:t>
       </w:r>
     </w:p>
@@ -28995,11 +27378,11 @@
       <w:pPr>
         <w:pStyle w:val="Heading3"/>
       </w:pPr>
-      <w:bookmarkStart w:id="123" w:name="p-541-fallback-no-staff"/>
+      <w:bookmarkStart w:id="120" w:name="p-541-fallback-no-staff"/>
       <w:r>
         <w:t xml:space="preserve">P-541, FALLBACK (NO Staff)</w:t>
       </w:r>
-      <w:bookmarkEnd w:id="123"/>
+      <w:bookmarkEnd w:id="120"/>
     </w:p>
     <w:p>
       <w:pPr>
@@ -29206,11 +27589,11 @@
       <w:pPr>
         <w:pStyle w:val="Heading2"/>
       </w:pPr>
-      <w:bookmarkStart w:id="124" w:name="p-550-crumbs-pushback-the-bank-offer"/>
+      <w:bookmarkStart w:id="121" w:name="p-550-crumbs-pushback-the-bank-offer"/>
       <w:r>
         <w:t xml:space="preserve">P-550, CRUMB’S PUSHBACK: THE BANK OFFER</w:t>
       </w:r>
-      <w:bookmarkEnd w:id="124"/>
+      <w:bookmarkEnd w:id="121"/>
     </w:p>
     <w:p>
       <w:pPr>
@@ -29428,11 +27811,11 @@
       <w:pPr>
         <w:pStyle w:val="Heading2"/>
       </w:pPr>
-      <w:bookmarkStart w:id="125" w:name="p-551-the-chosen-family-pivot"/>
+      <w:bookmarkStart w:id="122" w:name="p-551-the-chosen-family-pivot"/>
       <w:r>
         <w:t xml:space="preserve">P-551, ★ THE CHOSEN-FAMILY PIVOT ★</w:t>
       </w:r>
-      <w:bookmarkEnd w:id="125"/>
+      <w:bookmarkEnd w:id="122"/>
     </w:p>
     <w:p>
       <w:pPr>
@@ -29752,11 +28135,11 @@
       <w:pPr>
         <w:pStyle w:val="Heading2"/>
       </w:pPr>
-      <w:bookmarkStart w:id="126" w:name="p-552-a-kid-takes-it-apart"/>
+      <w:bookmarkStart w:id="123" w:name="p-552-a-kid-takes-it-apart"/>
       <w:r>
         <w:t xml:space="preserve">P-552, A KID TAKES IT APART</w:t>
       </w:r>
-      <w:bookmarkEnd w:id="126"/>
+      <w:bookmarkEnd w:id="123"/>
     </w:p>
     <w:p>
       <w:pPr>
@@ -30064,21 +28447,50 @@
       <w:pPr>
         <w:pStyle w:val="Heading2"/>
       </w:pPr>
-      <w:bookmarkStart w:id="127" w:name="beat-5-kellen"/>
+      <w:bookmarkStart w:id="124" w:name="beat-5-kellen"/>
       <w:r>
         <w:t xml:space="preserve">BEAT 5, KELLEN</w:t>
       </w:r>
-      <w:bookmarkEnd w:id="127"/>
+      <w:bookmarkEnd w:id="124"/>
+    </w:p>
+    <w:p>
+      <w:pPr>
+        <w:pStyle w:val="BlockText"/>
+      </w:pPr>
+      <w:r>
+        <w:rPr>
+          <w:b/>
+        </w:rPr>
+        <w:t xml:space="preserve">Reader: which version do you read?</w:t>
+      </w:r>
+      <w:r>
+        <w:t xml:space="preserve"> </w:t>
+      </w:r>
+      <w:r>
+        <w:rPr>
+          <w:i/>
+        </w:rPr>
+        <w:t xml:space="preserve">If you played Kellen’s chapter, read the MAIN version below (Kellen has his True-Skipping Stone).</w:t>
+      </w:r>
+      <w:r>
+        <w:t xml:space="preserve"> </w:t>
+      </w:r>
+      <w:r>
+        <w:rPr>
+          <w:i/>
+        </w:rPr>
+        <w:t xml:space="preserve">If you skipped Kellen’s chapter, skip to the FALLBACK version, Kellen wins her beat through who she is, not what she brought back.</w:t>
+      </w:r>
     </w:p>
     <w:p>
       <w:pPr>
         <w:pStyle w:val="Heading3"/>
       </w:pPr>
-      <w:bookmarkStart w:id="128" w:name="p-560-main-requires-stone"/>
+      <w:bookmarkStart w:id="125" w:name="p-560-main-requires-stone"/>
       <w:r>
         <w:t xml:space="preserve">P-560, MAIN (REQUIRES: Stone)</w:t>
       </w:r>
-      <w:bookmarkEnd w:id="128"/>
+      <w:bookmarkEnd w:id="125"/>
     </w:p>
     <w:p>
       <w:pPr>
@@ -30088,6 +28500,17 @@
         <w:rPr>
           <w:i/>
         </w:rPr>
+        <w:t xml:space="preserve">Kellen the Whole.</w:t>
+      </w:r>
+    </w:p>
+    <w:p>
+      <w:pPr>
+        <w:pStyle w:val="BodyText"/>
+      </w:pPr>
+      <w:r>
+        <w:rPr>
+          <w:i/>
+        </w:rPr>
         <w:t xml:space="preserve">~350 words.</w:t>
       </w:r>
     </w:p>
@@ -30278,11 +28701,11 @@
       <w:pPr>
         <w:pStyle w:val="Heading3"/>
       </w:pPr>
-      <w:bookmarkStart w:id="129" w:name="p-561-fallback-no-stone"/>
+      <w:bookmarkStart w:id="126" w:name="p-561-fallback-no-stone"/>
       <w:r>
         <w:t xml:space="preserve">P-561, FALLBACK (NO Stone)</w:t>
       </w:r>
-      <w:bookmarkEnd w:id="129"/>
+      <w:bookmarkEnd w:id="126"/>
     </w:p>
     <w:p>
       <w:pPr>
@@ -30469,21 +28892,50 @@
       <w:pPr>
         <w:pStyle w:val="Heading2"/>
       </w:pPr>
-      <w:bookmarkStart w:id="130" w:name="beat-6-keira"/>
+      <w:bookmarkStart w:id="127" w:name="beat-6-keira"/>
       <w:r>
         <w:t xml:space="preserve">BEAT 6, KEIRA</w:t>
       </w:r>
-      <w:bookmarkEnd w:id="130"/>
+      <w:bookmarkEnd w:id="127"/>
+    </w:p>
+    <w:p>
+      <w:pPr>
+        <w:pStyle w:val="BlockText"/>
+      </w:pPr>
+      <w:r>
+        <w:rPr>
+          <w:b/>
+        </w:rPr>
+        <w:t xml:space="preserve">Reader: which version do you read?</w:t>
+      </w:r>
+      <w:r>
+        <w:t xml:space="preserve"> </w:t>
+      </w:r>
+      <w:r>
+        <w:rPr>
+          <w:i/>
+        </w:rPr>
+        <w:t xml:space="preserve">If you played Keira’s chapter, read the MAIN version below (Keira has her Truth Brush).</w:t>
+      </w:r>
+      <w:r>
+        <w:t xml:space="preserve"> </w:t>
+      </w:r>
+      <w:r>
+        <w:rPr>
+          <w:i/>
+        </w:rPr>
+        <w:t xml:space="preserve">If you skipped Keira’s chapter, skip to the FALLBACK version, Keira wins her beat through who she is, not what she brought back.</w:t>
+      </w:r>
     </w:p>
     <w:p>
       <w:pPr>
         <w:pStyle w:val="Heading3"/>
       </w:pPr>
-      <w:bookmarkStart w:id="131" w:name="p-570-main-requires-brush"/>
+      <w:bookmarkStart w:id="128" w:name="p-570-main-requires-brush"/>
       <w:r>
         <w:t xml:space="preserve">P-570, MAIN (REQUIRES: Brush)</w:t>
       </w:r>
-      <w:bookmarkEnd w:id="131"/>
+      <w:bookmarkEnd w:id="128"/>
     </w:p>
     <w:p>
       <w:pPr>
@@ -30493,6 +28945,17 @@
         <w:rPr>
           <w:i/>
         </w:rPr>
+        <w:t xml:space="preserve">Keira Both-at-Once.</w:t>
+      </w:r>
+    </w:p>
+    <w:p>
+      <w:pPr>
+        <w:pStyle w:val="BodyText"/>
+      </w:pPr>
+      <w:r>
+        <w:rPr>
+          <w:i/>
+        </w:rPr>
         <w:t xml:space="preserve">~350 words.</w:t>
       </w:r>
     </w:p>
@@ -30687,11 +29150,11 @@
       <w:pPr>
         <w:pStyle w:val="Heading3"/>
       </w:pPr>
-      <w:bookmarkStart w:id="132" w:name="p-571-fallback-no-brush"/>
+      <w:bookmarkStart w:id="129" w:name="p-571-fallback-no-brush"/>
       <w:r>
         <w:t xml:space="preserve">P-571, FALLBACK (NO Brush)</w:t>
       </w:r>
-      <w:bookmarkEnd w:id="132"/>
+      <w:bookmarkEnd w:id="129"/>
     </w:p>
     <w:p>
       <w:pPr>
@@ -30859,21 +29322,50 @@
       <w:pPr>
         <w:pStyle w:val="Heading2"/>
       </w:pPr>
-      <w:bookmarkStart w:id="133" w:name="beat-7-ella"/>
+      <w:bookmarkStart w:id="130" w:name="beat-7-ella"/>
       <w:r>
         <w:t xml:space="preserve">BEAT 7, ELLA</w:t>
       </w:r>
-      <w:bookmarkEnd w:id="133"/>
+      <w:bookmarkEnd w:id="130"/>
+    </w:p>
+    <w:p>
+      <w:pPr>
+        <w:pStyle w:val="BlockText"/>
+      </w:pPr>
+      <w:r>
+        <w:rPr>
+          <w:b/>
+        </w:rPr>
+        <w:t xml:space="preserve">Reader: which version do you read?</w:t>
+      </w:r>
+      <w:r>
+        <w:t xml:space="preserve"> </w:t>
+      </w:r>
+      <w:r>
+        <w:rPr>
+          <w:i/>
+        </w:rPr>
+        <w:t xml:space="preserve">If you played Ella’s chapter, read the MAIN version below (Ella has her crown).</w:t>
+      </w:r>
+      <w:r>
+        <w:t xml:space="preserve"> </w:t>
+      </w:r>
+      <w:r>
+        <w:rPr>
+          <w:i/>
+        </w:rPr>
+        <w:t xml:space="preserve">If you skipped Ella’s chapter, skip to the FALLBACK version, Ella wins her beat through who she is, not what she brought back.</w:t>
+      </w:r>
     </w:p>
     <w:p>
       <w:pPr>
         <w:pStyle w:val="Heading3"/>
       </w:pPr>
-      <w:bookmarkStart w:id="134" w:name="p-580-main-requires-crown"/>
+      <w:bookmarkStart w:id="131" w:name="p-580-main-requires-crown"/>
       <w:r>
         <w:t xml:space="preserve">P-580, MAIN (REQUIRES: Crown)</w:t>
       </w:r>
-      <w:bookmarkEnd w:id="134"/>
+      <w:bookmarkEnd w:id="131"/>
     </w:p>
     <w:p>
       <w:pPr>
@@ -30883,6 +29375,17 @@
         <w:rPr>
           <w:i/>
         </w:rPr>
+        <w:t xml:space="preserve">Ella the Deciding Face.</w:t>
+      </w:r>
+    </w:p>
+    <w:p>
+      <w:pPr>
+        <w:pStyle w:val="BodyText"/>
+      </w:pPr>
+      <w:r>
+        <w:rPr>
+          <w:i/>
+        </w:rPr>
         <w:t xml:space="preserve">~350 words.</w:t>
       </w:r>
     </w:p>
@@ -31073,11 +29576,11 @@
       <w:pPr>
         <w:pStyle w:val="Heading3"/>
       </w:pPr>
-      <w:bookmarkStart w:id="135" w:name="p-581-fallback-no-crown"/>
+      <w:bookmarkStart w:id="132" w:name="p-581-fallback-no-crown"/>
       <w:r>
         <w:t xml:space="preserve">P-581, FALLBACK (NO Crown)</w:t>
       </w:r>
-      <w:bookmarkEnd w:id="135"/>
+      <w:bookmarkEnd w:id="132"/>
     </w:p>
     <w:p>
       <w:pPr>
@@ -31284,21 +29787,50 @@
       <w:pPr>
         <w:pStyle w:val="Heading2"/>
       </w:pPr>
-      <w:bookmarkStart w:id="136" w:name="beat-8-aiden"/>
+      <w:bookmarkStart w:id="133" w:name="beat-8-aiden"/>
       <w:r>
         <w:t xml:space="preserve">BEAT 8, AIDEN</w:t>
       </w:r>
-      <w:bookmarkEnd w:id="136"/>
+      <w:bookmarkEnd w:id="133"/>
+    </w:p>
+    <w:p>
+      <w:pPr>
+        <w:pStyle w:val="BlockText"/>
+      </w:pPr>
+      <w:r>
+        <w:rPr>
+          <w:b/>
+        </w:rPr>
+        <w:t xml:space="preserve">Reader: which version do you read?</w:t>
+      </w:r>
+      <w:r>
+        <w:t xml:space="preserve"> </w:t>
+      </w:r>
+      <w:r>
+        <w:rPr>
+          <w:i/>
+        </w:rPr>
+        <w:t xml:space="preserve">If you played Aiden’s chapter, read the MAIN version below (Aiden has Pegasus).</w:t>
+      </w:r>
+      <w:r>
+        <w:t xml:space="preserve"> </w:t>
+      </w:r>
+      <w:r>
+        <w:rPr>
+          <w:i/>
+        </w:rPr>
+        <w:t xml:space="preserve">If you skipped Aiden’s chapter, skip to the FALLBACK version, Aiden wins her beat through who she is, not what she brought back.</w:t>
+      </w:r>
     </w:p>
     <w:p>
       <w:pPr>
         <w:pStyle w:val="Heading3"/>
       </w:pPr>
-      <w:bookmarkStart w:id="137" w:name="p-590-main-requires-pegasus"/>
+      <w:bookmarkStart w:id="134" w:name="p-590-main-requires-pegasus"/>
       <w:r>
         <w:t xml:space="preserve">P-590, MAIN (REQUIRES: Pegasus) ★</w:t>
       </w:r>
-      <w:bookmarkEnd w:id="137"/>
+      <w:bookmarkEnd w:id="134"/>
     </w:p>
     <w:p>
       <w:pPr>
@@ -31308,6 +29840,17 @@
         <w:rPr>
           <w:i/>
         </w:rPr>
+        <w:t xml:space="preserve">Aiden the Exactly-Right.</w:t>
+      </w:r>
+    </w:p>
+    <w:p>
+      <w:pPr>
+        <w:pStyle w:val="BodyText"/>
+      </w:pPr>
+      <w:r>
+        <w:rPr>
+          <w:i/>
+        </w:rPr>
         <w:t xml:space="preserve">~500 words. This is THE moment. Never cut this.</w:t>
       </w:r>
     </w:p>
@@ -31640,11 +30183,11 @@
       <w:pPr>
         <w:pStyle w:val="Heading3"/>
       </w:pPr>
-      <w:bookmarkStart w:id="138" w:name="Xcf44ddac3abbb5065049bcc2787ea586074dc97"/>
+      <w:bookmarkStart w:id="135" w:name="Xcf44ddac3abbb5065049bcc2787ea586074dc97"/>
       <w:r>
         <w:t xml:space="preserve">P-591, FALLBACK (NO Pegasus, rare; means Aiden’s branch was skipped)</w:t>
       </w:r>
-      <w:bookmarkEnd w:id="138"/>
+      <w:bookmarkEnd w:id="135"/>
     </w:p>
     <w:p>
       <w:pPr>
@@ -31816,11 +30359,11 @@
       <w:pPr>
         <w:pStyle w:val="Heading2"/>
       </w:pPr>
-      <w:bookmarkStart w:id="139" w:name="p-595-the-c-130-returns"/>
+      <w:bookmarkStart w:id="136" w:name="p-595-the-c-130-returns"/>
       <w:r>
         <w:t xml:space="preserve">P-595, THE C-130 RETURNS</w:t>
       </w:r>
-      <w:bookmarkEnd w:id="139"/>
+      <w:bookmarkEnd w:id="136"/>
     </w:p>
     <w:p>
       <w:pPr>
@@ -32030,11 +30573,11 @@
       <w:pPr>
         <w:pStyle w:val="Heading2"/>
       </w:pPr>
-      <w:bookmarkStart w:id="140" w:name="p-596-crumb-breaks"/>
+      <w:bookmarkStart w:id="137" w:name="p-596-crumb-breaks"/>
       <w:r>
         <w:t xml:space="preserve">P-596, CRUMB BREAKS</w:t>
       </w:r>
-      <w:bookmarkEnd w:id="140"/>
+      <w:bookmarkEnd w:id="137"/>
     </w:p>
     <w:p>
       <w:pPr>
@@ -32153,11 +30696,11 @@
       <w:pPr>
         <w:pStyle w:val="Heading2"/>
       </w:pPr>
-      <w:bookmarkStart w:id="141" w:name="p-600-count-items-route-to-ending"/>
+      <w:bookmarkStart w:id="138" w:name="p-600-count-items-route-to-ending"/>
       <w:r>
         <w:t xml:space="preserve">P-600, COUNT ITEMS (ROUTE TO ENDING)</w:t>
       </w:r>
-      <w:bookmarkEnd w:id="141"/>
+      <w:bookmarkEnd w:id="138"/>
     </w:p>
     <w:p>
       <w:pPr>
@@ -32223,11 +30766,11 @@
       <w:pPr>
         <w:pStyle w:val="Heading2"/>
       </w:pPr>
-      <w:bookmarkStart w:id="142" w:name="X9bc1edf2386896bcf50951125b500782e92c6d1"/>
+      <w:bookmarkStart w:id="139" w:name="X9bc1edf2386896bcf50951125b500782e92c6d1"/>
       <w:r>
         <w:t xml:space="preserve">P-601, CROWN ENDING: THE DOCK HEALS OVERNIGHT</w:t>
       </w:r>
-      <w:bookmarkEnd w:id="142"/>
+      <w:bookmarkEnd w:id="139"/>
     </w:p>
     <w:p>
       <w:pPr>
@@ -32517,11 +31060,11 @@
       <w:pPr>
         <w:pStyle w:val="Heading2"/>
       </w:pPr>
-      <w:bookmarkStart w:id="143" w:name="X78143616331ab5e20bb0aa34fcd877b5d71c249"/>
+      <w:bookmarkStart w:id="140" w:name="X78143616331ab5e20bb0aa34fcd877b5d71c249"/>
       <w:r>
         <w:t xml:space="preserve">P-602, SILVER ENDING: COME BACK NEXT SUMMER</w:t>
       </w:r>
-      <w:bookmarkEnd w:id="143"/>
+      <w:bookmarkEnd w:id="140"/>
     </w:p>
     <w:p>
       <w:pPr>
@@ -32780,11 +31323,225 @@
     </w:p>
     <w:p>
       <w:pPr>
+        <w:pStyle w:val="Heading1"/>
+      </w:pPr>
+      <w:bookmarkStart w:id="141" w:name="endings"/>
+      <w:r>
+        <w:t xml:space="preserve">Endings</w:t>
+      </w:r>
+      <w:bookmarkEnd w:id="141"/>
+    </w:p>
+    <w:p>
+      <w:pPr>
+        <w:pStyle w:val="FirstParagraph"/>
+      </w:pPr>
+      <w:r>
+        <w:t xml:space="preserve">There are three endings to</w:t>
+      </w:r>
+      <w:r>
+        <w:t xml:space="preserve"> </w:t>
+      </w:r>
+      <w:r>
+        <w:rPr>
+          <w:i/>
+        </w:rPr>
+        <w:t xml:space="preserve">The Old Roar</w:t>
+      </w:r>
+      <w:r>
+        <w:t xml:space="preserve">. Read whichever one matches your playthrough, or read all three.</w:t>
+      </w:r>
+    </w:p>
+    <w:p>
+      <w:pPr>
         <w:pStyle w:val="Heading2"/>
       </w:pPr>
-      <w:bookmarkStart w:id="144" w:name="editor-notes-8"/>
-      <w:r>
-        <w:t xml:space="preserve">Editor notes</w:t>
+      <w:bookmarkStart w:id="142" w:name="the-crown-ending"/>
+      <w:r>
+        <w:t xml:space="preserve">The Crown Ending</w:t>
+      </w:r>
+      <w:bookmarkEnd w:id="142"/>
+    </w:p>
+    <w:p>
+      <w:pPr>
+        <w:pStyle w:val="FirstParagraph"/>
+      </w:pPr>
+      <w:r>
+        <w:rPr>
+          <w:i/>
+        </w:rPr>
+        <w:t xml:space="preserve">The deepest path. Full alliance. Earned by reaching the FULL version of your cousin’s item, plus an ally, plus a hidden flag.</w:t>
+      </w:r>
+    </w:p>
+    <w:p>
+      <w:pPr>
+        <w:pStyle w:val="BodyText"/>
+      </w:pPr>
+      <w:r>
+        <w:t xml:space="preserve">You went deep. You found the FULL version of what your cousin came to The Old Roar to find. You made the bravest choice when the lake offered it. You came home with an ally, an item that hums, and at least one secret tucked somewhere only you would know how to find.</w:t>
+      </w:r>
+    </w:p>
+    <w:p>
+      <w:pPr>
+        <w:pStyle w:val="BodyText"/>
+      </w:pPr>
+      <w:r>
+        <w:t xml:space="preserve">The dock is safe, not just for this summer.</w:t>
+      </w:r>
+      <w:r>
+        <w:t xml:space="preserve"> </w:t>
+      </w:r>
+      <w:r>
+        <w:rPr>
+          <w:i/>
+        </w:rPr>
+        <w:t xml:space="preserve">Forever.</w:t>
+      </w:r>
+      <w:r>
+        <w:t xml:space="preserve"> </w:t>
+      </w:r>
+      <w:r>
+        <w:t xml:space="preserve">The magic that came home with you doesn’t fade. It quietly lives in the boards now.</w:t>
+      </w:r>
+    </w:p>
+    <w:p>
+      <w:pPr>
+        <w:pStyle w:val="BodyText"/>
+      </w:pPr>
+      <w:r>
+        <w:t xml:space="preserve">Reid’s staff has rooted in the lake-bed and the third piling is now part of the lake itself. Keira’s cliff, Cliffy, is across the cove, half-watching the cabin every minute of every day, his colors still visible if you tilt your head right. Carson’s mammoth, Big Coulee, has a worn track up the back canyon her family uses every summer that the grown-ups will never explain. Ella’s Bright Water frogs live under the dock now, and the kids will sometimes see the herald at dusk with a tiny scroll he’s still trying to deliver. Kellen’s Skip-Stone flock comes through every July, the smallest of them perched on his shoulder for a week before flying on. Chayten’s otters, Otto, Pickle, and the Driftwood Players, leave small smooth things on the rocks at dawn, one for each cousin, never explained. Madison’s Canyon Singer keeps singing across the cove on still nights, and Aiden’s mother, who is shyer than she pretends, finally answers her, the first summer Aiden is in middle school, with a small voice from the back deck nobody else hears. Pegasus visits Aiden in the sunroom every full moon and goes back to the world to find her next rider.</w:t>
+      </w:r>
+    </w:p>
+    <w:p>
+      <w:pPr>
+        <w:pStyle w:val="BodyText"/>
+      </w:pPr>
+      <w:r>
+        <w:t xml:space="preserve">The cousins are the keepers of a secret bigger than the cabin. They will be the keepers of it for the rest of their lives. When the youngest of them is forty, they will still gather on the third of July, jump from the dock at the same instant, surface together, look at each other, and silently confirm:</w:t>
+      </w:r>
+      <w:r>
+        <w:t xml:space="preserve"> </w:t>
+      </w:r>
+      <w:r>
+        <w:rPr>
+          <w:i/>
+        </w:rPr>
+        <w:t xml:space="preserve">we remember. We were there. It was real.</w:t>
+      </w:r>
+    </w:p>
+    <w:p>
+      <w:pPr>
+        <w:pStyle w:val="BodyText"/>
+      </w:pPr>
+      <w:r>
+        <w:t xml:space="preserve">Every summer their own children will run to the dock and jump in at the same instant, not knowing yet what is holding the boards up.</w:t>
+      </w:r>
+    </w:p>
+    <w:p>
+      <w:pPr>
+        <w:pStyle w:val="BodyText"/>
+      </w:pPr>
+      <w:r>
+        <w:t xml:space="preserve">The summer always starts the same way. And the summer always will.</w:t>
+      </w:r>
+    </w:p>
+    <w:p>
+      <w:pPr>
+        <w:pStyle w:val="Heading2"/>
+      </w:pPr>
+      <w:bookmarkStart w:id="143" w:name="the-silver-ending"/>
+      <w:r>
+        <w:t xml:space="preserve">The Silver Ending</w:t>
+      </w:r>
+      <w:bookmarkEnd w:id="143"/>
+    </w:p>
+    <w:p>
+      <w:pPr>
+        <w:pStyle w:val="FirstParagraph"/>
+      </w:pPr>
+      <w:r>
+        <w:rPr>
+          <w:i/>
+        </w:rPr>
+        <w:t xml:space="preserve">A middle-depth playthrough.</w:t>
+      </w:r>
+    </w:p>
+    <w:p>
+      <w:pPr>
+        <w:pStyle w:val="BodyText"/>
+      </w:pPr>
+      <w:r>
+        <w:t xml:space="preserve">You went somewhere in the middle. You came back with an</w:t>
+      </w:r>
+      <w:r>
+        <w:t xml:space="preserve"> </w:t>
+      </w:r>
+      <w:r>
+        <w:rPr>
+          <w:i/>
+        </w:rPr>
+        <w:t xml:space="preserve">enhanced</w:t>
+      </w:r>
+      <w:r>
+        <w:t xml:space="preserve"> </w:t>
+      </w:r>
+      <w:r>
+        <w:t xml:space="preserve">version of what your cousin needed. Maybe an ally. A flag or two. The choices were generous but not as deep as they could have been.</w:t>
+      </w:r>
+    </w:p>
+    <w:p>
+      <w:pPr>
+        <w:pStyle w:val="BodyText"/>
+      </w:pPr>
+      <w:r>
+        <w:t xml:space="preserve">The dock stands. Drystone has been chased off. The wobbly third plank is fixed (mostly). The cove is safe this summer.</w:t>
+      </w:r>
+    </w:p>
+    <w:p>
+      <w:pPr>
+        <w:pStyle w:val="BodyText"/>
+      </w:pPr>
+      <w:r>
+        <w:t xml:space="preserve">Some of the magic stayed asleep. The deepest secrets in the cousin’s region didn’t open for you this time. The creature you met there will dream of</w:t>
+      </w:r>
+      <w:r>
+        <w:t xml:space="preserve"> </w:t>
+      </w:r>
+      <w:r>
+        <w:rPr>
+          <w:i/>
+        </w:rPr>
+        <w:t xml:space="preserve">you</w:t>
+      </w:r>
+      <w:r>
+        <w:t xml:space="preserve"> </w:t>
+      </w:r>
+      <w:r>
+        <w:t xml:space="preserve">for years, wondering what would have happened if you had gone one choice further. You will dream of them, too.</w:t>
+      </w:r>
+    </w:p>
+    <w:p>
+      <w:pPr>
+        <w:pStyle w:val="BodyText"/>
+      </w:pPr>
+      <w:r>
+        <w:t xml:space="preserve">But the cousins all remember. They will, every summer, jump from the dock at the same instant. They will, every summer, swim across to the cliff face and touch it. They will, every summer, leave a small thing on the rocks for the otters, a piece of cookie, a stone, a piece of driftwood, and they will never tell anyone why.</w:t>
+      </w:r>
+    </w:p>
+    <w:p>
+      <w:pPr>
+        <w:pStyle w:val="BodyText"/>
+      </w:pPr>
+      <w:r>
+        <w:t xml:space="preserve">One day, maybe next summer, one of them will go back into the lake-below and find the path they missed. The dock will hold until they do.</w:t>
+      </w:r>
+    </w:p>
+    <w:p>
+      <w:pPr>
+        <w:pStyle w:val="Heading2"/>
+      </w:pPr>
+      <w:bookmarkStart w:id="144" w:name="the-bronze-ending"/>
+      <w:r>
+        <w:t xml:space="preserve">The Bronze Ending</w:t>
       </w:r>
       <w:bookmarkEnd w:id="144"/>
     </w:p>
@@ -32794,373 +31551,75 @@
       </w:pPr>
       <w:r>
         <w:rPr>
-          <w:b/>
-        </w:rPr>
-        <w:t xml:space="preserve">On the chosen-family pivot (P-551 / P-552):</w:t>
-      </w:r>
-      <w:r>
-        <w:t xml:space="preserve"> </w:t>
-      </w:r>
-      <w:r>
-        <w:t xml:space="preserve">This is the structural payoff for the theme that’s been planted in every region. Drystone’s seam-finding speech is harsh and feels like the harshest thing in the book, but it has to be, because the kids’ rebuttal has to feel earned. Carson taking it apart with</w:t>
-      </w:r>
-      <w:r>
-        <w:t xml:space="preserve"> </w:t>
-      </w:r>
-      <w:r>
-        <w:rPr>
-          <w:i/>
-        </w:rPr>
-        <w:t xml:space="preserve">they showed up</w:t>
-      </w:r>
-      <w:r>
-        <w:t xml:space="preserve"> </w:t>
-      </w:r>
-      <w:r>
-        <w:t xml:space="preserve">is the thematic spine of the entire project. Madison’s notes.md promised this and v2 never delivered it. Delivered now.</w:t>
-      </w:r>
-    </w:p>
-    <w:p>
-      <w:pPr>
-        <w:pStyle w:val="BodyText"/>
-      </w:pPr>
-      <w:r>
-        <w:rPr>
-          <w:b/>
-        </w:rPr>
-        <w:t xml:space="preserve">On the modular beats:</w:t>
-      </w:r>
-      <w:r>
-        <w:t xml:space="preserve"> </w:t>
-      </w:r>
-      <w:r>
-        <w:t xml:space="preserve">Every kid has a main version and a fallback. The fallback is</w:t>
-      </w:r>
-      <w:r>
-        <w:t xml:space="preserve"> </w:t>
-      </w:r>
-      <w:r>
-        <w:rPr>
-          <w:i/>
-        </w:rPr>
-        <w:t xml:space="preserve">never weaker than the main version as a character moment</w:t>
-      </w:r>
-      <w:r>
-        <w:t xml:space="preserve">, it’s just smaller in physical scale. Madison without the map still has her memorized facts. Reid without the staff still has his immovability. Ella without the crown still has her deciding face. The book never punishes the reader’s kid by making the kid look weak.</w:t>
-      </w:r>
-    </w:p>
-    <w:p>
-      <w:pPr>
-        <w:pStyle w:val="BodyText"/>
-      </w:pPr>
-      <w:r>
-        <w:rPr>
-          <w:b/>
-        </w:rPr>
-        <w:t xml:space="preserve">On the locked crossover rule applied:</w:t>
-      </w:r>
-      <w:r>
-        <w:t xml:space="preserve"> </w:t>
-      </w:r>
-      <w:r>
-        <w:t xml:space="preserve">Every conditional ally moment specifies what the adults vs. Drystone vs. the kids see. Drystone’s progressive vision of more and more impossible creatures is a deliberate building of his breakdown. By the end he’s seeing a small magical zoo and una</w:t>
-      </w:r>
-      <w:r>
-        <w:t xml:space="preserve"> </w:t>
-      </w:r>
-      <w:r>
-        <w:t xml:space="preserve"># Endings</w:t>
-      </w:r>
-    </w:p>
-    <w:p>
-      <w:pPr>
-        <w:pStyle w:val="BodyText"/>
-      </w:pPr>
-      <w:r>
-        <w:t xml:space="preserve">There are three endings to</w:t>
-      </w:r>
-      <w:r>
-        <w:t xml:space="preserve"> </w:t>
-      </w:r>
-      <w:r>
-        <w:rPr>
-          <w:i/>
-        </w:rPr>
-        <w:t xml:space="preserve">The Old Roar</w:t>
-      </w:r>
-      <w:r>
-        <w:t xml:space="preserve">. Read whichever one matches your playthrough, or read all three.</w:t>
-      </w:r>
-    </w:p>
-    <w:p>
-      <w:pPr>
-        <w:pStyle w:val="Heading2"/>
-      </w:pPr>
-      <w:bookmarkStart w:id="145" w:name="the-crown-ending"/>
-      <w:r>
-        <w:t xml:space="preserve">The Crown Ending</w:t>
+          <w:i/>
+        </w:rPr>
+        <w:t xml:space="preserve">A surface playthrough.</w:t>
+      </w:r>
+    </w:p>
+    <w:p>
+      <w:pPr>
+        <w:pStyle w:val="BodyText"/>
+      </w:pPr>
+      <w:r>
+        <w:t xml:space="preserve">You took the quicker, surface choices. You came home with the</w:t>
+      </w:r>
+      <w:r>
+        <w:t xml:space="preserve"> </w:t>
+      </w:r>
+      <w:r>
+        <w:rPr>
+          <w:i/>
+        </w:rPr>
+        <w:t xml:space="preserve">base</w:t>
+      </w:r>
+      <w:r>
+        <w:t xml:space="preserve"> </w:t>
+      </w:r>
+      <w:r>
+        <w:t xml:space="preserve">version of what your cousin needed, the simple, honest tool. No ally walked back with you. The deepest beats stayed hidden.</w:t>
+      </w:r>
+    </w:p>
+    <w:p>
+      <w:pPr>
+        <w:pStyle w:val="BodyText"/>
+      </w:pPr>
+      <w:r>
+        <w:t xml:space="preserve">The dock stands. Drystone is gone. That part, the most important part, is a win. The boards under your feet are still the boards your grandfather laid down.</w:t>
+      </w:r>
+    </w:p>
+    <w:p>
+      <w:pPr>
+        <w:pStyle w:val="BodyText"/>
+      </w:pPr>
+      <w:r>
+        <w:t xml:space="preserve">But the rest of the lake-below is still waiting. The creature you met in the region remembers you. They will, somewhere in their own days, wonder what would have happened if you had asked the harder question, taken the slower path, climbed the cliff yourself. So will you, late at night this fall, when the school bus has been quiet for a while and you have time to think about it.</w:t>
+      </w:r>
+    </w:p>
+    <w:p>
+      <w:pPr>
+        <w:pStyle w:val="BodyText"/>
+      </w:pPr>
+      <w:r>
+        <w:t xml:space="preserve">The dock survives this summer.</w:t>
+      </w:r>
+    </w:p>
+    <w:p>
+      <w:pPr>
+        <w:pStyle w:val="BodyText"/>
+      </w:pPr>
+      <w:r>
+        <w:t xml:space="preserve">The next time you open the book, the deeper paths are still there. Listen harder at the cared-for moment. Ask the question you almost asked. Try the choice that feels slower or harder or stranger. Or pick a different cousin entirely.</w:t>
+      </w:r>
+    </w:p>
+    <w:p>
+      <w:pPr>
+        <w:pStyle w:val="Heading1"/>
+      </w:pPr>
+      <w:bookmarkStart w:id="145" w:name="the-authors"/>
+      <w:r>
+        <w:t xml:space="preserve">The Authors</w:t>
       </w:r>
       <w:bookmarkEnd w:id="145"/>
-    </w:p>
-    <w:p>
-      <w:pPr>
-        <w:pStyle w:val="FirstParagraph"/>
-      </w:pPr>
-      <w:r>
-        <w:rPr>
-          <w:i/>
-        </w:rPr>
-        <w:t xml:space="preserve">The deepest path. Full alliance. Earned by reaching the FULL version of your cousin’s item, plus an ally, plus a hidden flag.</w:t>
-      </w:r>
-    </w:p>
-    <w:p>
-      <w:pPr>
-        <w:pStyle w:val="BodyText"/>
-      </w:pPr>
-      <w:r>
-        <w:t xml:space="preserve">You went deep. You found the FULL version of what your cousin came to The Old Roar to find. You made the bravest choice when the lake offered it. You came home with an ally, an item that hums, and at least one secret tucked somewhere only you would know how to find.</w:t>
-      </w:r>
-    </w:p>
-    <w:p>
-      <w:pPr>
-        <w:pStyle w:val="BodyText"/>
-      </w:pPr>
-      <w:r>
-        <w:t xml:space="preserve">The dock is safe, not just for this summer.</w:t>
-      </w:r>
-      <w:r>
-        <w:t xml:space="preserve"> </w:t>
-      </w:r>
-      <w:r>
-        <w:rPr>
-          <w:i/>
-        </w:rPr>
-        <w:t xml:space="preserve">Forever.</w:t>
-      </w:r>
-      <w:r>
-        <w:t xml:space="preserve"> </w:t>
-      </w:r>
-      <w:r>
-        <w:t xml:space="preserve">The magic that came home with you doesn’t fade. It quietly lives in the boards now.</w:t>
-      </w:r>
-    </w:p>
-    <w:p>
-      <w:pPr>
-        <w:pStyle w:val="BodyText"/>
-      </w:pPr>
-      <w:r>
-        <w:t xml:space="preserve">Reid’s staff has rooted in the lake-bed and the third piling is now part of the lake itself. Keira’s cliff, Cliffy, is across the cove, half-watching the cabin every minute of every day, his colors still visible if you tilt your head right. Carson’s mammoth, Big Coulee, has a worn track up the back canyon her family uses every summer that the grown-ups will never explain. Ella’s Bright Water frogs live under the dock now, and the kids will sometimes see the herald at dusk with a tiny scroll he’s still trying to deliver. Kellen’s Skip-Stone flock comes through every July, the smallest of them perched on his shoulder for a week before flying on. Chayten’s otters, Otto, Pickle, and the Driftwood Players, leave small smooth things on the rocks at dawn, one for each cousin, never explained. Madison’s Canyon Singer keeps singing across the cove on still nights, and Aiden’s mother, who is shyer than she pretends, finally answers her, the first summer Aiden is in middle school, with a small voice from the back deck nobody else hears. Pegasus visits Aiden in the sunroom every full moon and goes back to the world to find her next rider.</w:t>
-      </w:r>
-    </w:p>
-    <w:p>
-      <w:pPr>
-        <w:pStyle w:val="BodyText"/>
-      </w:pPr>
-      <w:r>
-        <w:t xml:space="preserve">The cousins are the keepers of a secret bigger than the cabin. They will be the keepers of it for the rest of their lives. When the youngest of them is forty, they will still gather on the third of July, jump from the dock at the same instant, surface together, look at each other, and silently confirm:</w:t>
-      </w:r>
-      <w:r>
-        <w:t xml:space="preserve"> </w:t>
-      </w:r>
-      <w:r>
-        <w:rPr>
-          <w:i/>
-        </w:rPr>
-        <w:t xml:space="preserve">we remember. We were there. It was real.</w:t>
-      </w:r>
-    </w:p>
-    <w:p>
-      <w:pPr>
-        <w:pStyle w:val="BodyText"/>
-      </w:pPr>
-      <w:r>
-        <w:t xml:space="preserve">Every summer their own children will run to the dock and jump in at the same instant, not knowing yet what is holding the boards up.</w:t>
-      </w:r>
-    </w:p>
-    <w:p>
-      <w:pPr>
-        <w:pStyle w:val="BodyText"/>
-      </w:pPr>
-      <w:r>
-        <w:t xml:space="preserve">The summer always starts the same way. And the summer always will.</w:t>
-      </w:r>
-    </w:p>
-    <w:p>
-      <w:pPr>
-        <w:pStyle w:val="Heading2"/>
-      </w:pPr>
-      <w:bookmarkStart w:id="146" w:name="the-silver-ending"/>
-      <w:r>
-        <w:t xml:space="preserve">The Silver Ending</w:t>
-      </w:r>
-      <w:bookmarkEnd w:id="146"/>
-    </w:p>
-    <w:p>
-      <w:pPr>
-        <w:pStyle w:val="FirstParagraph"/>
-      </w:pPr>
-      <w:r>
-        <w:rPr>
-          <w:i/>
-        </w:rPr>
-        <w:t xml:space="preserve">A middle-depth playthrough.</w:t>
-      </w:r>
-    </w:p>
-    <w:p>
-      <w:pPr>
-        <w:pStyle w:val="BodyText"/>
-      </w:pPr>
-      <w:r>
-        <w:t xml:space="preserve">You went somewhere in the middle. You came back with an</w:t>
-      </w:r>
-      <w:r>
-        <w:t xml:space="preserve"> </w:t>
-      </w:r>
-      <w:r>
-        <w:rPr>
-          <w:i/>
-        </w:rPr>
-        <w:t xml:space="preserve">enhanced</w:t>
-      </w:r>
-      <w:r>
-        <w:t xml:space="preserve"> </w:t>
-      </w:r>
-      <w:r>
-        <w:t xml:space="preserve">version of what your cousin needed. Maybe an ally. A flag or two. The choices were generous but not as deep as they could have been.</w:t>
-      </w:r>
-    </w:p>
-    <w:p>
-      <w:pPr>
-        <w:pStyle w:val="BodyText"/>
-      </w:pPr>
-      <w:r>
-        <w:t xml:space="preserve">The dock stands. Drystone has been chased off. The wobbly third plank is fixed (mostly). The cove is safe this summer.</w:t>
-      </w:r>
-    </w:p>
-    <w:p>
-      <w:pPr>
-        <w:pStyle w:val="BodyText"/>
-      </w:pPr>
-      <w:r>
-        <w:t xml:space="preserve">Some of the magic stayed asleep. The deepest secrets in the cousin’s region didn’t open for you this time. The creature you met there will dream of</w:t>
-      </w:r>
-      <w:r>
-        <w:t xml:space="preserve"> </w:t>
-      </w:r>
-      <w:r>
-        <w:rPr>
-          <w:i/>
-        </w:rPr>
-        <w:t xml:space="preserve">you</w:t>
-      </w:r>
-      <w:r>
-        <w:t xml:space="preserve"> </w:t>
-      </w:r>
-      <w:r>
-        <w:t xml:space="preserve">for years, wondering what would have happened if you had gone one choice further. You will dream of them, too.</w:t>
-      </w:r>
-    </w:p>
-    <w:p>
-      <w:pPr>
-        <w:pStyle w:val="BodyText"/>
-      </w:pPr>
-      <w:r>
-        <w:t xml:space="preserve">But the cousins all remember. They will, every summer, jump from the dock at the same instant. They will, every summer, swim across to the cliff face and touch it. They will, every summer, leave a small thing on the rocks for the otters, a piece of cookie, a stone, a piece of driftwood, and they will never tell anyone why.</w:t>
-      </w:r>
-    </w:p>
-    <w:p>
-      <w:pPr>
-        <w:pStyle w:val="BodyText"/>
-      </w:pPr>
-      <w:r>
-        <w:t xml:space="preserve">One day, maybe next summer, one of them will go back into the lake-below and find the path they missed. The dock will hold until they do.</w:t>
-      </w:r>
-    </w:p>
-    <w:p>
-      <w:pPr>
-        <w:pStyle w:val="Heading2"/>
-      </w:pPr>
-      <w:bookmarkStart w:id="147" w:name="the-bronze-ending"/>
-      <w:r>
-        <w:t xml:space="preserve">The Bronze Ending</w:t>
-      </w:r>
-      <w:bookmarkEnd w:id="147"/>
-    </w:p>
-    <w:p>
-      <w:pPr>
-        <w:pStyle w:val="FirstParagraph"/>
-      </w:pPr>
-      <w:r>
-        <w:rPr>
-          <w:i/>
-        </w:rPr>
-        <w:t xml:space="preserve">A surface playthrough.</w:t>
-      </w:r>
-    </w:p>
-    <w:p>
-      <w:pPr>
-        <w:pStyle w:val="BodyText"/>
-      </w:pPr>
-      <w:r>
-        <w:t xml:space="preserve">You took the quicker, surface choices. You came home with the</w:t>
-      </w:r>
-      <w:r>
-        <w:t xml:space="preserve"> </w:t>
-      </w:r>
-      <w:r>
-        <w:rPr>
-          <w:i/>
-        </w:rPr>
-        <w:t xml:space="preserve">base</w:t>
-      </w:r>
-      <w:r>
-        <w:t xml:space="preserve"> </w:t>
-      </w:r>
-      <w:r>
-        <w:t xml:space="preserve">version of what your cousin needed, the simple, honest tool. No ally walked back with you. The deepest beats stayed hidden.</w:t>
-      </w:r>
-    </w:p>
-    <w:p>
-      <w:pPr>
-        <w:pStyle w:val="BodyText"/>
-      </w:pPr>
-      <w:r>
-        <w:t xml:space="preserve">The dock stands. Drystone is gone. That part, the most important part, is a win. The boards under your feet are still the boards your grandfather laid down.</w:t>
-      </w:r>
-    </w:p>
-    <w:p>
-      <w:pPr>
-        <w:pStyle w:val="BodyText"/>
-      </w:pPr>
-      <w:r>
-        <w:t xml:space="preserve">But the rest of the lake-below is still waiting. The creature you met in the region remembers you. They will, somewhere in their own days, wonder what would have happened if you had asked the harder question, taken the slower path, climbed the cliff yourself. So will you, late at night this fall, when the school bus has been quiet for a while and you have time to think about it.</w:t>
-      </w:r>
-    </w:p>
-    <w:p>
-      <w:pPr>
-        <w:pStyle w:val="BodyText"/>
-      </w:pPr>
-      <w:r>
-        <w:t xml:space="preserve">The dock survives this summer.</w:t>
-      </w:r>
-    </w:p>
-    <w:p>
-      <w:pPr>
-        <w:pStyle w:val="BodyText"/>
-      </w:pPr>
-      <w:r>
-        <w:t xml:space="preserve">The next time you open the book, the deeper paths are still there. Listen harder at the cared-for moment. Ask the question you almost asked. Try the choice that feels slower or harder or stranger. Or pick a different cousin entirely.</w:t>
-      </w:r>
-    </w:p>
-    <w:p>
-      <w:pPr>
-        <w:pStyle w:val="Heading1"/>
-      </w:pPr>
-      <w:bookmarkStart w:id="148" w:name="the-authors"/>
-      <w:r>
-        <w:t xml:space="preserve">The Authors</w:t>
-      </w:r>
-      <w:bookmarkEnd w:id="148"/>
     </w:p>
     <w:p>
       <w:pPr>
@@ -33184,11 +31643,11 @@
       <w:pPr>
         <w:pStyle w:val="Heading3"/>
       </w:pPr>
-      <w:bookmarkStart w:id="149" w:name="madison-15"/>
+      <w:bookmarkStart w:id="146" w:name="madison-15"/>
       <w:r>
         <w:t xml:space="preserve">Madison · 15</w:t>
       </w:r>
-      <w:bookmarkEnd w:id="149"/>
+      <w:bookmarkEnd w:id="146"/>
     </w:p>
     <w:p>
       <w:pPr>
@@ -33265,11 +31724,11 @@
       <w:pPr>
         <w:pStyle w:val="Heading3"/>
       </w:pPr>
-      <w:bookmarkStart w:id="150" w:name="carson-15"/>
+      <w:bookmarkStart w:id="147" w:name="carson-15"/>
       <w:r>
         <w:t xml:space="preserve">Carson · 15</w:t>
       </w:r>
-      <w:bookmarkEnd w:id="150"/>
+      <w:bookmarkEnd w:id="147"/>
     </w:p>
     <w:p>
       <w:pPr>
@@ -33346,11 +31805,11 @@
       <w:pPr>
         <w:pStyle w:val="Heading3"/>
       </w:pPr>
-      <w:bookmarkStart w:id="151" w:name="reid-14"/>
+      <w:bookmarkStart w:id="148" w:name="reid-14"/>
       <w:r>
         <w:t xml:space="preserve">Reid · 14</w:t>
       </w:r>
-      <w:bookmarkEnd w:id="151"/>
+      <w:bookmarkEnd w:id="148"/>
     </w:p>
     <w:p>
       <w:pPr>
@@ -33427,11 +31886,11 @@
       <w:pPr>
         <w:pStyle w:val="Heading3"/>
       </w:pPr>
-      <w:bookmarkStart w:id="152" w:name="chayten-13"/>
+      <w:bookmarkStart w:id="149" w:name="chayten-13"/>
       <w:r>
         <w:t xml:space="preserve">Chayten · 13</w:t>
       </w:r>
-      <w:bookmarkEnd w:id="152"/>
+      <w:bookmarkEnd w:id="149"/>
     </w:p>
     <w:p>
       <w:pPr>
@@ -33501,11 +31960,11 @@
       <w:pPr>
         <w:pStyle w:val="Heading1"/>
       </w:pPr>
-      <w:bookmarkStart w:id="153" w:name="the-authors-continued"/>
+      <w:bookmarkStart w:id="150" w:name="the-authors-continued"/>
       <w:r>
         <w:t xml:space="preserve">The Authors, continued</w:t>
       </w:r>
-      <w:bookmarkEnd w:id="153"/>
+      <w:bookmarkEnd w:id="150"/>
     </w:p>
     <w:p>
       <w:r>
@@ -33518,11 +31977,11 @@
       <w:pPr>
         <w:pStyle w:val="Heading3"/>
       </w:pPr>
-      <w:bookmarkStart w:id="154" w:name="kellen-12"/>
+      <w:bookmarkStart w:id="151" w:name="kellen-12"/>
       <w:r>
         <w:t xml:space="preserve">Kellen · 12</w:t>
       </w:r>
-      <w:bookmarkEnd w:id="154"/>
+      <w:bookmarkEnd w:id="151"/>
     </w:p>
     <w:p>
       <w:pPr>
@@ -33599,11 +32058,11 @@
       <w:pPr>
         <w:pStyle w:val="Heading3"/>
       </w:pPr>
-      <w:bookmarkStart w:id="155" w:name="keira-10"/>
+      <w:bookmarkStart w:id="152" w:name="keira-10"/>
       <w:r>
         <w:t xml:space="preserve">Keira · 10</w:t>
       </w:r>
-      <w:bookmarkEnd w:id="155"/>
+      <w:bookmarkEnd w:id="152"/>
     </w:p>
     <w:p>
       <w:pPr>
@@ -33680,11 +32139,11 @@
       <w:pPr>
         <w:pStyle w:val="Heading3"/>
       </w:pPr>
-      <w:bookmarkStart w:id="156" w:name="ella-10"/>
+      <w:bookmarkStart w:id="153" w:name="ella-10"/>
       <w:r>
         <w:t xml:space="preserve">Ella · 10</w:t>
       </w:r>
-      <w:bookmarkEnd w:id="156"/>
+      <w:bookmarkEnd w:id="153"/>
     </w:p>
     <w:p>
       <w:pPr>
@@ -33761,11 +32220,11 @@
       <w:pPr>
         <w:pStyle w:val="Heading3"/>
       </w:pPr>
-      <w:bookmarkStart w:id="157" w:name="aiden-7"/>
+      <w:bookmarkStart w:id="154" w:name="aiden-7"/>
       <w:r>
         <w:t xml:space="preserve">Aiden · 7</w:t>
       </w:r>
-      <w:bookmarkEnd w:id="157"/>
+      <w:bookmarkEnd w:id="154"/>
     </w:p>
     <w:p>
       <w:pPr>

</xml_diff>